<commit_message>
Replace dashboard screenshots with console+k9s only; add APA captions
- Remove dashboard-c001 screenshot from docx
- Replace all dashboard images with console output screenshots
  (console-c001, console-d001, console-i002) and k9s-views
- Add APA-format figure captions (Figura 1-4) centered below each image
- Add hash-based tab navigation to console.html

Co-Authored-By: Claude Sonnet 4.6 <noreply@anthropic.com>
</commit_message>
<xml_diff>
--- a/Trabajo_Final_Moncada_SCE_v2.docx
+++ b/Trabajo_Final_Moncada_SCE_v2.docx
@@ -5517,54 +5517,7 @@
         <w:rPr/>
         <w:drawing>
           <wp:inline distB="114300" distT="114300" distL="114300" distR="114300">
-            <wp:extent cx="5502600" cy="3760000"/>
-            <wp:effectExtent b="0" l="0" r="0" t="0"/>
-            <wp:docPr id="2" name="image3.png"/>
-            <a:graphic>
-              <a:graphicData uri="http://schemas.openxmlformats.org/drawingml/2006/picture">
-                <pic:pic>
-                  <pic:nvPicPr>
-                    <pic:cNvPr id="0" name="image3.png"/>
-                    <pic:cNvPicPr preferRelativeResize="0"/>
-                  </pic:nvPicPr>
-                  <pic:blipFill>
-                    <a:blip r:embed="rId8"/>
-                    <a:srcRect b="0" l="0" r="0" t="0"/>
-                    <a:stretch>
-                      <a:fillRect/>
-                    </a:stretch>
-                  </pic:blipFill>
-                  <pic:spPr>
-                    <a:xfrm>
-                      <a:off x="0" y="0"/>
-                      <a:ext cx="5502600" cy="3760000"/>
-                    </a:xfrm>
-                    <a:prstGeom prst="rect"/>
-                    <a:ln/>
-                  </pic:spPr>
-                </pic:pic>
-              </a:graphicData>
-            </a:graphic>
-          </wp:inline>
-        </w:drawing>
-      </w:r>
-      <w:r>
-        <w:rPr>
-          <w:rtl w:val="0"/>
-        </w:rPr>
-      </w:r>
-    </w:p>
-    <w:p>
-      <w:pPr>
-        <w:spacing w:after="120" w:before="120" w:line="276" w:lineRule="auto"/>
-        <w:jc w:val="both"/>
-        <w:rPr/>
-      </w:pPr>
-      <w:r>
-        <w:rPr/>
-        <w:drawing>
-          <wp:inline distB="114300" distT="114300" distL="114300" distR="114300">
-            <wp:extent cx="5502600" cy="4127000"/>
+            <wp:extent cx="5502600" cy="3537385"/>
             <wp:effectExtent b="0" l="0" r="0" t="0"/>
             <wp:docPr id="5" name="image1.png"/>
             <a:graphic>
@@ -5584,7 +5537,7 @@
                   <pic:spPr>
                     <a:xfrm>
                       <a:off x="0" y="0"/>
-                      <a:ext cx="5502600" cy="4127000"/>
+                      <a:ext cx="5502600" cy="3537385"/>
                     </a:xfrm>
                     <a:prstGeom prst="rect"/>
                     <a:ln/>
@@ -5603,6 +5556,23 @@
     </w:p>
     <w:p>
       <w:pPr>
+        <w:spacing w:after="160" w:before="60" w:line="276" w:lineRule="auto"/>
+        <w:jc w:val="center"/>
+        <w:rPr/>
+      </w:pPr>
+      <w:r>
+        <w:rPr>
+          <w:i/>
+        </w:rPr>
+        <w:t xml:space="preserve">Figura 1. </w:t>
+      </w:r>
+      <w:r>
+        <w:rPr/>
+        <w:t>Salida de consola del experimento SCE-C-001 — Confidencialidad: detección de credenciales expuestas en variables de entorno y bloqueo de exfiltración de red y DNS. Elaboración propia (2026).</w:t>
+      </w:r>
+    </w:p>
+    <w:p>
+      <w:pPr>
         <w:spacing w:after="120" w:before="120" w:line="276" w:lineRule="auto"/>
         <w:jc w:val="both"/>
         <w:rPr/>
@@ -5611,7 +5581,7 @@
         <w:rPr/>
         <w:drawing>
           <wp:inline distB="114300" distT="114300" distL="114300" distR="114300">
-            <wp:extent cx="5502600" cy="5044600"/>
+            <wp:extent cx="5502600" cy="3537385"/>
             <wp:effectExtent b="0" l="0" r="0" t="0"/>
             <wp:docPr id="4" name="image4.png"/>
             <a:graphic>
@@ -5631,7 +5601,7 @@
                   <pic:spPr>
                     <a:xfrm>
                       <a:off x="0" y="0"/>
-                      <a:ext cx="5502600" cy="5044600"/>
+                      <a:ext cx="5502600" cy="3537385"/>
                     </a:xfrm>
                     <a:prstGeom prst="rect"/>
                     <a:ln/>
@@ -5646,6 +5616,23 @@
         <w:rPr>
           <w:rtl w:val="0"/>
         </w:rPr>
+      </w:r>
+    </w:p>
+    <w:p>
+      <w:pPr>
+        <w:spacing w:after="160" w:before="60" w:line="276" w:lineRule="auto"/>
+        <w:jc w:val="center"/>
+        <w:rPr/>
+      </w:pPr>
+      <w:r>
+        <w:rPr>
+          <w:i/>
+        </w:rPr>
+        <w:t xml:space="preserve">Figura 2. </w:t>
+      </w:r>
+      <w:r>
+        <w:rPr/>
+        <w:t>Vistas k9s del clúster sce-lab durante la ejecución de los tres experimentos SCE: estado de pods, políticas de red activas y hallazgos de seguridad detectados por experimento. Elaboración propia (2026).</w:t>
       </w:r>
     </w:p>
     <w:p>
@@ -5678,7 +5665,7 @@
                   <pic:spPr>
                     <a:xfrm>
                       <a:off x="0" y="0"/>
-                      <a:ext cx="5502600" cy="3760000"/>
+                      <a:ext cx="5502600" cy="3537385"/>
                     </a:xfrm>
                     <a:prstGeom prst="rect"/>
                     <a:ln/>
@@ -5693,6 +5680,23 @@
         <w:rPr>
           <w:rtl w:val="0"/>
         </w:rPr>
+      </w:r>
+    </w:p>
+    <w:p>
+      <w:pPr>
+        <w:spacing w:after="160" w:before="60" w:line="276" w:lineRule="auto"/>
+        <w:jc w:val="center"/>
+        <w:rPr/>
+      </w:pPr>
+      <w:r>
+        <w:rPr>
+          <w:i/>
+        </w:rPr>
+        <w:t xml:space="preserve">Figura 3. </w:t>
+      </w:r>
+      <w:r>
+        <w:rPr/>
+        <w:t>Salida de consola del experimento SCE-D-001 — Disponibilidad: verificación del comportamiento fail-secure del servicio de autenticación ante escenario de escala-a-cero. Elaboración propia (2026).</w:t>
       </w:r>
     </w:p>
     <w:p>
@@ -6761,7 +6765,7 @@
                   <pic:spPr>
                     <a:xfrm>
                       <a:off x="0" y="0"/>
-                      <a:ext cx="5502600" cy="3760000"/>
+                      <a:ext cx="5502600" cy="3537385"/>
                     </a:xfrm>
                     <a:prstGeom prst="rect"/>
                     <a:ln/>
@@ -6776,6 +6780,23 @@
         <w:rPr>
           <w:rtl w:val="0"/>
         </w:rPr>
+      </w:r>
+    </w:p>
+    <w:p>
+      <w:pPr>
+        <w:spacing w:after="160" w:before="60" w:line="276" w:lineRule="auto"/>
+        <w:jc w:val="center"/>
+        <w:rPr/>
+      </w:pPr>
+      <w:r>
+        <w:rPr>
+          <w:i/>
+        </w:rPr>
+        <w:t xml:space="preserve">Figura 4. </w:t>
+      </w:r>
+      <w:r>
+        <w:rPr/>
+        <w:t>Salida de consola del experimento SCE-I-002 — Integridad: bloqueo de escritura en /var/log, detección de inyección stdout vía /proc/1/fd/1 y protección del host de auditoría. Elaboración propia (2026).</w:t>
       </w:r>
     </w:p>
     <w:p>

</xml_diff>

<commit_message>
Add APA references to all three tables in docx
Each table now has:
- Bold "Tabla N" title above
- Italic descriptive title below the number
- Italic "Nota. Elaboración propia (2026)." after the table

Co-Authored-By: Claude Sonnet 4.6 <noreply@anthropic.com>
</commit_message>
<xml_diff>
--- a/Trabajo_Final_Moncada_SCE_v2.docx
+++ b/Trabajo_Final_Moncada_SCE_v2.docx
@@ -3750,6 +3750,30 @@
           <w:rtl w:val="0"/>
         </w:rPr>
         <w:t xml:space="preserve">La Tabla 1 presenta un resumen consolidado de los siete experimentos del catálogo, facilitando la comparación y priorización en función de la dimensión CIA, el nivel de riesgo y la herramienta principal recomendada.</w:t>
+      </w:r>
+    </w:p>
+    <w:p>
+      <w:pPr>
+        <w:spacing w:after="40" w:before="120" w:line="276" w:lineRule="auto"/>
+        <w:rPr/>
+      </w:pPr>
+      <w:r>
+        <w:rPr>
+          <w:b/>
+        </w:rPr>
+        <w:t>Tabla 1</w:t>
+      </w:r>
+    </w:p>
+    <w:p>
+      <w:pPr>
+        <w:spacing w:after="80" w:before="0" w:line="276" w:lineRule="auto"/>
+        <w:rPr/>
+      </w:pPr>
+      <w:r>
+        <w:rPr>
+          <w:i/>
+        </w:rPr>
+        <w:t>Catálogo de experimentos SCE: dimensión CIA, nivel de riesgo y herramienta de detección principal</w:t>
       </w:r>
     </w:p>
     <w:tbl>
@@ -5250,6 +5274,22 @@
     </w:tbl>
     <w:p>
       <w:pPr>
+        <w:spacing w:after="120" w:before="60" w:line="276" w:lineRule="auto"/>
+        <w:rPr/>
+      </w:pPr>
+      <w:r>
+        <w:rPr>
+          <w:i/>
+        </w:rPr>
+        <w:t xml:space="preserve">Nota. </w:t>
+      </w:r>
+      <w:r>
+        <w:rPr/>
+        <w:t>Elaboración propia (2026).</w:t>
+      </w:r>
+    </w:p>
+    <w:p>
+      <w:pPr>
         <w:spacing w:after="200" w:lineRule="auto"/>
         <w:rPr/>
       </w:pPr>
@@ -5763,6 +5803,30 @@
           <w:rtl w:val="0"/>
         </w:rPr>
         <w:t xml:space="preserve">Los resultados de la PoC-001 se resumen en la Tabla 2.</w:t>
+      </w:r>
+    </w:p>
+    <w:p>
+      <w:pPr>
+        <w:spacing w:after="40" w:before="120" w:line="276" w:lineRule="auto"/>
+        <w:rPr/>
+      </w:pPr>
+      <w:r>
+        <w:rPr>
+          <w:b/>
+        </w:rPr>
+        <w:t>Tabla 2</w:t>
+      </w:r>
+    </w:p>
+    <w:p>
+      <w:pPr>
+        <w:spacing w:after="80" w:before="0" w:line="276" w:lineRule="auto"/>
+        <w:rPr/>
+      </w:pPr>
+      <w:r>
+        <w:rPr>
+          <w:i/>
+        </w:rPr>
+        <w:t>Resultados del experimento SCE-C-001: acciones de inyección, observaciones y evaluación de controles de seguridad</w:t>
       </w:r>
     </w:p>
     <w:tbl>
@@ -6699,6 +6763,22 @@
     </w:tbl>
     <w:p>
       <w:pPr>
+        <w:spacing w:after="120" w:before="60" w:line="276" w:lineRule="auto"/>
+        <w:rPr/>
+      </w:pPr>
+      <w:r>
+        <w:rPr>
+          <w:i/>
+        </w:rPr>
+        <w:t xml:space="preserve">Nota. </w:t>
+      </w:r>
+      <w:r>
+        <w:rPr/>
+        <w:t>Elaboración propia (2026).</w:t>
+      </w:r>
+    </w:p>
+    <w:p>
+      <w:pPr>
         <w:spacing w:after="160" w:lineRule="auto"/>
         <w:rPr/>
       </w:pPr>
@@ -7016,6 +7096,30 @@
           <w:rtl w:val="0"/>
         </w:rPr>
         <w:t xml:space="preserve">La Tabla 3 presenta el análisis consolidado de los cinco experimentos ejecutados.</w:t>
+      </w:r>
+    </w:p>
+    <w:p>
+      <w:pPr>
+        <w:spacing w:after="40" w:before="120" w:line="276" w:lineRule="auto"/>
+        <w:rPr/>
+      </w:pPr>
+      <w:r>
+        <w:rPr>
+          <w:b/>
+        </w:rPr>
+        <w:t>Tabla 3</w:t>
+      </w:r>
+    </w:p>
+    <w:p>
+      <w:pPr>
+        <w:spacing w:after="80" w:before="0" w:line="276" w:lineRule="auto"/>
+        <w:rPr/>
+      </w:pPr>
+      <w:r>
+        <w:rPr>
+          <w:i/>
+        </w:rPr>
+        <w:t>Análisis consolidado de resultados: hipótesis evaluadas, hallazgos secundarios y veredicto por experimento SCE</w:t>
       </w:r>
     </w:p>
     <w:tbl>
@@ -7950,6 +8054,22 @@
         </w:tc>
       </w:tr>
     </w:tbl>
+    <w:p>
+      <w:pPr>
+        <w:spacing w:after="120" w:before="60" w:line="276" w:lineRule="auto"/>
+        <w:rPr/>
+      </w:pPr>
+      <w:r>
+        <w:rPr>
+          <w:i/>
+        </w:rPr>
+        <w:t xml:space="preserve">Nota. </w:t>
+      </w:r>
+      <w:r>
+        <w:rPr/>
+        <w:t>Elaboración propia (2026).</w:t>
+      </w:r>
+    </w:p>
     <w:p>
       <w:pPr>
         <w:spacing w:after="160" w:lineRule="auto"/>

</xml_diff>

<commit_message>
Reduce document to 9,906 words (under 10,000 target)
Cuts made without losing substance:
- Introducción: replaced SolarWinds/Okta case studies paragraph with one sentence (~130w)
- 1.1: condensed Simian Army tool enumeration (~70w)
- 1.4: trimmed reproducibility paragraph (~50w)
- Conclusiones: removed "cambio de paradigma" and "En definitiva" paragraphs,
  condensed "líneas futuras" (~120w)

Co-Authored-By: Claude Sonnet 4.6 <noreply@anthropic.com>
</commit_message>
<xml_diff>
--- a/Trabajo_Final_Moncada_SCE_v2.docx
+++ b/Trabajo_Final_Moncada_SCE_v2.docx
@@ -1028,35 +1028,7 @@
         <w:rPr>
           <w:rtl w:val="0"/>
         </w:rPr>
-        <w:t xml:space="preserve">La evidencia empírica de esta afirmación es abundante y reciente. En 2021, la brecha de seguridad en </w:t>
-      </w:r>
-      <w:r>
-        <w:rPr>
-          <w:i w:val="1"/>
-          <w:iCs w:val="1"/>
-          <w:rtl w:val="0"/>
-        </w:rPr>
-        <w:t xml:space="preserve">SolarWinds</w:t>
-      </w:r>
-      <w:r>
-        <w:rPr>
-          <w:rtl w:val="0"/>
-        </w:rPr>
-        <w:t xml:space="preserve"> comprometió a más de dieciocho mil organizaciones a nivel global, incluyendo agencias gubernamentales de los Estados Unidos. El incidente no ocurrió por la ausencia de controles de seguridad, sino porque los mecanismos de verificación de integridad del pipeline de construcción de software no habían sido validados bajo condiciones adversas reales. En 2022, el ataque a la plataforma </w:t>
-      </w:r>
-      <w:r>
-        <w:rPr>
-          <w:i w:val="1"/>
-          <w:iCs w:val="1"/>
-          <w:rtl w:val="0"/>
-        </w:rPr>
-        <w:t xml:space="preserve">Okta</w:t>
-      </w:r>
-      <w:r>
-        <w:rPr>
-          <w:rtl w:val="0"/>
-        </w:rPr>
-        <w:t xml:space="preserve"> expuso que controles de acceso considerados robustos podían ser eludidos mediante la explotación de comportamientos emergentes en las dependencias de terceros. Estos casos ilustran un patrón consistente: los incidentes de mayor impacto no explotan la ausencia de controles, sino la brecha entre los controles declarados y su efectividad operativa real.</w:t>
+        <w:t>Los incidentes de mayor impacto no explotan la ausencia de controles, sino la brecha entre los controles declarados y su efectividad operativa real [1].</w:t>
       </w:r>
     </w:p>
     <w:p>
@@ -1274,57 +1246,386 @@
         <w:rPr>
           <w:rtl w:val="0"/>
         </w:rPr>
-        <w:t xml:space="preserve"> para incorporar herramientas especializadas: </w:t>
-      </w:r>
-      <w:r>
-        <w:rPr>
-          <w:i w:val="1"/>
-          <w:iCs w:val="1"/>
-          <w:rtl w:val="0"/>
-        </w:rPr>
-        <w:t xml:space="preserve">Latency Monkey</w:t>
-      </w:r>
-      <w:r>
-        <w:rPr>
-          <w:rtl w:val="0"/>
-        </w:rPr>
-        <w:t xml:space="preserve"> introducía retardos artificiales en las comunicaciones entre servicios; </w:t>
-      </w:r>
-      <w:r>
-        <w:rPr>
-          <w:i w:val="1"/>
-          <w:iCs w:val="1"/>
-          <w:rtl w:val="0"/>
-        </w:rPr>
-        <w:t xml:space="preserve">Conformity Monkey</w:t>
-      </w:r>
-      <w:r>
-        <w:rPr>
-          <w:rtl w:val="0"/>
-        </w:rPr>
-        <w:t xml:space="preserve"> identificaba instancias que no cumplían con las mejores prácticas de configuración; y </w:t>
-      </w:r>
-      <w:r>
-        <w:rPr>
-          <w:i w:val="1"/>
-          <w:iCs w:val="1"/>
-          <w:rtl w:val="0"/>
-        </w:rPr>
-        <w:t xml:space="preserve">Chaos Gorilla</w:t>
-      </w:r>
-      <w:r>
-        <w:rPr>
-          <w:rtl w:val="0"/>
-        </w:rPr>
-        <w:t xml:space="preserve"> simulaba la pérdida completa de una zona de disponibilidad de AWS. Esta evolución reflejó un aprendizaje fundamental: la resiliencia no es una propiedad binaria sino un espectro, y diferentes clases de fallos revelan diferentes debilidades. El ecosistema de herramientas de inyección de fallos se ha expandido considerablemente desde entonces, con plataformas como </w:t>
-      </w:r>
-      <w:r>
-        <w:rPr>
-          <w:i w:val="1"/>
-          <w:iCs w:val="1"/>
-          <w:rtl w:val="0"/>
-        </w:rPr>
-        <w:t>Gremlin, LitmusChaos</w:t>
+        <w:t xml:space="preserve"> para incorporar herramientas especializadas para diferentes clases de fallos: latencia de red, conformidad de configuración y pérdida de zonas de disponibilidad. Esta evolución reflejó un aprendizaje fundamental: la resiliencia no es una propiedad binaria sino un espectro.</w:t>
+      </w:r>
+    </w:p>
+    <w:p>
+      <w:pPr>
+        <w:spacing w:after="120" w:before="120" w:line="276" w:lineRule="auto"/>
+        <w:jc w:val="both"/>
+        <w:rPr/>
+      </w:pPr>
+      <w:r>
+        <w:rPr>
+          <w:rtl w:val="0"/>
+        </w:rPr>
+        <w:t xml:space="preserve">Lo que distingue a la Ingeniería del Caos de las pruebas de estrés o de los ejercicios de recuperación ante desastres tradicionales no es la severidad de los fallos que induce, sino el rigor epistemológico con el que los aborda. El proceso parte siempre de una hipótesis formulada en términos de comportamiento observable del sistema: no ¿qué pasa si este servicio cae? sino si este servicio cae, el sistema degradará graciosamente y los usuarios experimentarán latencias menores a x milisegundos sin pérdida de datos. Esta distinción es fundamental porque transforma la experimentación de un ejercicio de descubrimiento ad hoc en un proceso científico reproducible, con criterios de éxito y fracaso definidos de antemano [4].</w:t>
+      </w:r>
+    </w:p>
+    <w:p>
+      <w:pPr>
+        <w:spacing w:after="120" w:before="120" w:line="276" w:lineRule="auto"/>
+        <w:jc w:val="both"/>
+        <w:rPr/>
+      </w:pPr>
+      <w:r>
+        <w:rPr>
+          <w:rtl w:val="0"/>
+        </w:rPr>
+        <w:t xml:space="preserve">Los principios que codifican esta práctica fueron formalizados por Rosenthal et al. [2] y pueden resumirse en cinco postulados: primero, construir una hipótesis sobre el comportamiento en estado estable; segundo, variar eventos del mundo real que puedan afectar ese estado; tercero, ejecutar los experimentos en producción; cuarto, automatizar los experimentos para que se ejecuten continuamente; y quinto, minimizar el radio de explosión para limitar el impacto sobre usuarios reales. La tensión entre el tercer y el quinto principio “ejecutar en producción, pero minimizar el impacto” define gran parte de la madurez operativa necesaria para implementar un programa de Ingeniería del Caos responsable.</w:t>
+      </w:r>
+    </w:p>
+    <w:p>
+      <w:pPr>
+        <w:pStyle w:val="Heading2"/>
+        <w:rPr>
+          <w:color w:val="000000"/>
+        </w:rPr>
+      </w:pPr>
+      <w:r>
+        <w:rPr>
+          <w:color w:val="000000"/>
+          <w:rtl w:val="0"/>
+        </w:rPr>
+        <w:t xml:space="preserve">1.2 De la prevención a la preparación: antifragilidad y sistemas complejos</w:t>
+      </w:r>
+    </w:p>
+    <w:p>
+      <w:pPr>
+        <w:spacing w:after="120" w:before="120" w:line="276" w:lineRule="auto"/>
+        <w:jc w:val="both"/>
+        <w:rPr/>
+      </w:pPr>
+      <w:r>
+        <w:rPr>
+          <w:rtl w:val="0"/>
+        </w:rPr>
+        <w:t xml:space="preserve">Para comprender por qué la SCE representa un avance paradigmático respecto a los enfoques de seguridad convencionales, es necesario examinar dos marcos conceptuales que le dan sustento filosófico: la teoría de la antifragilidad de Nassim Nicholas Taleb y el modelo de comprensión del error humano en sistemas complejos de Sidney Dekker.</w:t>
+      </w:r>
+    </w:p>
+    <w:p>
+      <w:pPr>
+        <w:spacing w:after="120" w:before="120" w:line="276" w:lineRule="auto"/>
+        <w:jc w:val="both"/>
+        <w:rPr/>
+      </w:pPr>
+      <w:r>
+        <w:rPr>
+          <w:rtl w:val="0"/>
+        </w:rPr>
+        <w:t>Taleb propone una clasificación tripartita de los sistemas según su respuesta al desorden: los sistemas frágiles se deterioran con la volatilidad y el estrés; los sistemas robustos resisten sin cambiar; los sistemas antifrágiles mejoran con la exposición al desorden, la variabilidad y el estrés [5]. Esta clasificación tiene implicaciones directas para la seguridad informática. La mayoría de las estrategias de seguridad apuntan a construir sistemas robustos: mantener el estado bajo condiciones adversas mediante la acumulación de capas de controles preventivos. La SCE propone algo más ambicioso: construir sistemas que se vuelvan más seguros precisamente por haber sido expuestos, de forma controlada, a condiciones adversas. Cada experimento ejecutado que revela una debilidad y motiva una remediación convierte al sistema en más resiliente respecto a esa clase de fallo. El programa de SCE, en su conjunto, es un mecanismo de antifragilidad institucionalizado.</w:t>
+      </w:r>
+    </w:p>
+    <w:p>
+      <w:pPr>
+        <w:spacing w:after="120" w:before="120" w:line="276" w:lineRule="auto"/>
+        <w:jc w:val="both"/>
+        <w:rPr/>
+      </w:pPr>
+      <w:r>
+        <w:rPr>
+          <w:rtl w:val="0"/>
+        </w:rPr>
+        <w:t xml:space="preserve">Dekker ofrece una perspectiva igualmente valiosa desde la ergonomía cognitiva y la ingeniería de sistemas complejos. Su modelo </w:t>
+      </w:r>
+      <w:r>
+        <w:rPr>
+          <w:i w:val="1"/>
+          <w:iCs w:val="1"/>
+          <w:rtl w:val="0"/>
+        </w:rPr>
+        <w:t xml:space="preserve">New View</w:t>
+      </w:r>
+      <w:r>
+        <w:rPr>
+          <w:rtl w:val="0"/>
+        </w:rPr>
+        <w:t xml:space="preserve"> sobre el error humano sostiene que los accidentes y fallos en sistemas complejos no son causados por la presencia de componentes defectuosos o actores negligentes, sino por la interacción de elementos que, individualmente, funcionan correctamente [6]. Esta propiedad, denominada en la literatura de seguridad de sistemas como teoría de los accidentes normales, tiene implicaciones directas para la ciberseguridad: los incidentes más graves no suelen ser el resultado de una única vulnerabilidad crítica sino de la convergencia de múltiples configuraciones subóptimas, comportamientos inesperados bajo carga y supuestos incorrectos sobre las dependencias del sistema. Los experimentos de caos están diseñados precisamente para crear las condiciones en las que estas convergencias emergen de forma controlada.</w:t>
+      </w:r>
+    </w:p>
+    <w:p>
+      <w:pPr>
+        <w:spacing w:after="120" w:before="120" w:line="276" w:lineRule="auto"/>
+        <w:jc w:val="both"/>
+        <w:rPr/>
+      </w:pPr>
+      <w:r>
+        <w:rPr>
+          <w:rtl w:val="0"/>
+        </w:rPr>
+        <w:t xml:space="preserve">Este marco conceptual justifica el cambio de paradigma que la SCE propone. Si los fallos son propiedades emergentes de sistemas complejos y no anomalías evitables, entonces la estrategia de seguridad no puede limitarse a fortalecer componentes individuales. Debe, en cambio, verificar empíricamente cómo se comporta el sistema como totalidad cuando esos componentes fallan, y construir sobre esa evidencia una confianza objetiva “no asumida” en su resiliencia.</w:t>
+      </w:r>
+    </w:p>
+    <w:p>
+      <w:pPr>
+        <w:pStyle w:val="Heading2"/>
+        <w:rPr>
+          <w:color w:val="000000"/>
+        </w:rPr>
+      </w:pPr>
+      <w:r>
+        <w:rPr>
+          <w:color w:val="000000"/>
+          <w:rtl w:val="0"/>
+        </w:rPr>
+        <w:t xml:space="preserve">1.3 </w:t>
+      </w:r>
+      <w:r>
+        <w:rPr>
+          <w:i w:val="1"/>
+          <w:iCs w:val="1"/>
+          <w:color w:val="000000"/>
+          <w:rtl w:val="0"/>
+        </w:rPr>
+        <w:t xml:space="preserve">Security Chaos Engineering</w:t>
+      </w:r>
+      <w:r>
+        <w:rPr>
+          <w:color w:val="000000"/>
+          <w:rtl w:val="0"/>
+        </w:rPr>
+        <w:t xml:space="preserve">: definición, alcance y diferenciación</w:t>
+      </w:r>
+    </w:p>
+    <w:p>
+      <w:pPr>
+        <w:spacing w:after="120" w:before="120" w:line="276" w:lineRule="auto"/>
+        <w:jc w:val="both"/>
+        <w:rPr/>
+      </w:pPr>
+      <w:r>
+        <w:rPr>
+          <w:rtl w:val="0"/>
+        </w:rPr>
+        <w:t xml:space="preserve">La </w:t>
+      </w:r>
+      <w:r>
+        <w:rPr>
+          <w:i w:val="1"/>
+          <w:iCs w:val="1"/>
+          <w:rtl w:val="0"/>
+        </w:rPr>
+        <w:t xml:space="preserve">Security Chaos Engineering</w:t>
+      </w:r>
+      <w:r>
+        <w:rPr>
+          <w:rtl w:val="0"/>
+        </w:rPr>
+        <w:t xml:space="preserve"> (SCE) es definida por Shortridge y Rinehart como la aplicación de los principios de la Ingeniería del Caos al dominio de la ciberseguridad, con el objetivo de descubrir debilidades en los controles de seguridad, verificar la efectividad de los mecanismos de detección y respuesta, y generar confianza cuantificable en la resiliencia del sistema frente a condiciones adversas con impacto sobre la seguridad de la información [1].</w:t>
+      </w:r>
+    </w:p>
+    <w:p>
+      <w:pPr>
+        <w:spacing w:after="120" w:before="120" w:line="276" w:lineRule="auto"/>
+        <w:jc w:val="both"/>
+        <w:rPr/>
+      </w:pPr>
+      <w:r>
+        <w:rPr>
+          <w:rtl w:val="0"/>
+        </w:rPr>
+        <w:t xml:space="preserve">Es fundamental delimitar el alcance de la SCE respecto a la Ingeniería del Caos de infraestructura, con la que comparte metodología, pero difiere en objetivos. Un experimento de caos de infraestructura típico podría consistir en terminar nodos de un clúster de Kubernetes y verificar que el orquestador reprograme los </w:t>
+      </w:r>
+      <w:r>
+        <w:rPr>
+          <w:i w:val="1"/>
+          <w:iCs w:val="1"/>
+          <w:rtl w:val="0"/>
+        </w:rPr>
+        <w:t xml:space="preserve">pods</w:t>
+      </w:r>
+      <w:r>
+        <w:rPr>
+          <w:rtl w:val="0"/>
+        </w:rPr>
+        <w:t xml:space="preserve"> correctamente, manteniendo los SLOs de disponibilidad. El objetivo es la continuidad del servicio. Un experimento de SCE, en contraste, podría consistir en simular la exfiltración de credenciales de un </w:t>
+      </w:r>
+      <w:r>
+        <w:rPr>
+          <w:i w:val="1"/>
+          <w:iCs w:val="1"/>
+          <w:rtl w:val="0"/>
+        </w:rPr>
+        <w:t xml:space="preserve">pod</w:t>
+      </w:r>
+      <w:r>
+        <w:rPr>
+          <w:rtl w:val="0"/>
+        </w:rPr>
+        <w:t xml:space="preserve"> comprometido y verificar que los sistemas de detección lo identifiquen, que los mecanismos de rotación de secretos funcionen dentro del tiempo esperado y que el acceso no autorizado sea contenido antes de alcanzar datos sensibles. El objetivo es la seguridad de la información.</w:t>
+      </w:r>
+    </w:p>
+    <w:p>
+      <w:pPr>
+        <w:spacing w:after="120" w:before="120" w:line="276" w:lineRule="auto"/>
+        <w:jc w:val="both"/>
+        <w:rPr/>
+      </w:pPr>
+      <w:r>
+        <w:rPr>
+          <w:rtl w:val="0"/>
+        </w:rPr>
+        <w:t xml:space="preserve">La tríada CIA “Confidencialidad, Integridad y Disponibilidad” constituye el eje organizador de los experimentos en el marco de la SCE. Cada experimento debe poder mapearse hacia uno o más de estos pilares y formular hipótesis verificables sobre el comportamiento de los controles de seguridad correspondientes. Los experimentos de confidencialidad verifican que la información no sea accesible a entidades no autorizadas incluso bajo condiciones de fallo. Los de integridad verifican que los datos no puedan ser modificados o corrompidos sin que los mecanismos de detección lo registren. Los de disponibilidad, en el contexto específico de la SCE, no se limitan a verificar el </w:t>
+      </w:r>
+      <w:r>
+        <w:rPr>
+          <w:i w:val="1"/>
+          <w:iCs w:val="1"/>
+          <w:rtl w:val="0"/>
+        </w:rPr>
+        <w:t xml:space="preserve">uptime</w:t>
+      </w:r>
+      <w:r>
+        <w:rPr>
+          <w:rtl w:val="0"/>
+        </w:rPr>
+        <w:t xml:space="preserve"> del servicio sino la disponibilidad de la información para usuarios autorizados incluso cuando los sistemas de autenticación o autorización experimentan fallos parciales.</w:t>
+      </w:r>
+    </w:p>
+    <w:p>
+      <w:pPr>
+        <w:spacing w:after="120" w:before="120" w:line="276" w:lineRule="auto"/>
+        <w:jc w:val="both"/>
+        <w:rPr/>
+      </w:pPr>
+      <w:r>
+        <w:rPr>
+          <w:rtl w:val="0"/>
+        </w:rPr>
+        <w:t xml:space="preserve">La relación entre la SCE y el </w:t>
+      </w:r>
+      <w:r>
+        <w:rPr>
+          <w:i w:val="1"/>
+          <w:iCs w:val="1"/>
+          <w:rtl w:val="0"/>
+        </w:rPr>
+        <w:t xml:space="preserve">Site Reliability Engineering</w:t>
+      </w:r>
+      <w:r>
+        <w:rPr>
+          <w:rtl w:val="0"/>
+        </w:rPr>
+        <w:t xml:space="preserve"> merece una mención particular. Beyer et al. establecen que el SRE define la confiabilidad como una propiedad del sistema que debe ser medida, presupuestada y gestionada mediante </w:t>
+      </w:r>
+      <w:r>
+        <w:rPr>
+          <w:i w:val="1"/>
+          <w:iCs w:val="1"/>
+          <w:rtl w:val="0"/>
+        </w:rPr>
+        <w:t xml:space="preserve">error budgets</w:t>
+      </w:r>
+      <w:r>
+        <w:rPr>
+          <w:rtl w:val="0"/>
+        </w:rPr>
+        <w:t xml:space="preserve"> [3]. La SCE puede entenderse como la extensión natural de esta filosofía al dominio de la seguridad: así como el SRE utiliza el </w:t>
+      </w:r>
+      <w:r>
+        <w:rPr>
+          <w:i w:val="1"/>
+          <w:iCs w:val="1"/>
+          <w:rtl w:val="0"/>
+        </w:rPr>
+        <w:t xml:space="preserve">error budget</w:t>
+      </w:r>
+      <w:r>
+        <w:rPr>
+          <w:rtl w:val="0"/>
+        </w:rPr>
+        <w:t xml:space="preserve"> para gestionar el riesgo de disponibilidad, la SCE propone un presupuesto de resiliencia de seguridad que cuantifica el nivel de confianza en los controles basado en evidencia experimental. Ambas disciplinas comparten la convicción de que la confianza no declarada, sino medida, es la única confianza válida en sistemas de producción [3].</w:t>
+      </w:r>
+    </w:p>
+    <w:p>
+      <w:pPr>
+        <w:pStyle w:val="Heading2"/>
+        <w:rPr>
+          <w:color w:val="000000"/>
+        </w:rPr>
+      </w:pPr>
+      <w:r>
+        <w:rPr>
+          <w:color w:val="000000"/>
+          <w:rtl w:val="0"/>
+        </w:rPr>
+        <w:t xml:space="preserve">1.4 Justificación del uso de Kubernetes como plataforma experimental</w:t>
+      </w:r>
+    </w:p>
+    <w:p>
+      <w:pPr>
+        <w:spacing w:after="120" w:before="120" w:line="276" w:lineRule="auto"/>
+        <w:jc w:val="both"/>
+        <w:rPr/>
+      </w:pPr>
+      <w:r>
+        <w:rPr>
+          <w:rtl w:val="0"/>
+        </w:rPr>
+        <w:t xml:space="preserve">La selección de una plataforma de orquestación de contenedores como entorno de referencia para el diseño y la ejecución de experimentos de SCE no es una decisión tecnológica arbitraria, sino una consecuencia directa de las condiciones que caracterizan los entornos de producción modernos. Kubernetes (K8s) se ha consolidado como el estándar de facto en la industria para la orquestación de cargas de trabajo en contenedores: según la encuesta anual de la </w:t>
+      </w:r>
+      <w:r>
+        <w:rPr>
+          <w:i w:val="1"/>
+          <w:iCs w:val="1"/>
+          <w:rtl w:val="0"/>
+        </w:rPr>
+        <w:t xml:space="preserve">Cloud Native Computing Foundation</w:t>
+      </w:r>
+      <w:r>
+        <w:rPr>
+          <w:rtl w:val="0"/>
+        </w:rPr>
+        <w:t xml:space="preserve"> correspondiente a 2023, el 96% de las organizaciones encuestadas utilizan o evalúan Kubernetes en sus entornos productivos [11]. Esta adopción masiva implica que un marco metodológico de SCE diseñado sobre K8s tiene aplicabilidad directa en la gran mayoría de las organizaciones que operan arquitecturas de microservicios, lo que maximiza la relevancia práctica del catálogo de experimentos propuesto.</w:t>
+      </w:r>
+    </w:p>
+    <w:p>
+      <w:pPr>
+        <w:spacing w:after="120" w:before="120" w:line="276" w:lineRule="auto"/>
+        <w:jc w:val="both"/>
+        <w:rPr/>
+      </w:pPr>
+      <w:r>
+        <w:rPr>
+          <w:rtl w:val="0"/>
+        </w:rPr>
+        <w:t xml:space="preserve">Más allá de su prevalencia, Kubernetes presenta propiedades estructurales que lo convierten en la plataforma ideal para la experimentación en seguridad. Su modelo de seguridad nativo está construido sobre primitivas que son, al mismo tiempo, objetos de validación experimental y vectores de ataque documentados en marcos adversariales como MITRE ATT&amp;CK for Containers [7]. El Control de Acceso Basado en Roles (RBAC) define qué </w:t>
+      </w:r>
+      <w:r>
+        <w:rPr>
+          <w:i w:val="1"/>
+          <w:iCs w:val="1"/>
+          <w:rtl w:val="0"/>
+        </w:rPr>
+        <w:t xml:space="preserve">ServiceAccounts</w:t>
+      </w:r>
+      <w:r>
+        <w:rPr>
+          <w:rtl w:val="0"/>
+        </w:rPr>
+        <w:t xml:space="preserve"> pueden realizar qué operaciones sobre qué recursos de la API; las </w:t>
+      </w:r>
+      <w:r>
+        <w:rPr>
+          <w:i w:val="1"/>
+          <w:iCs w:val="1"/>
+          <w:rtl w:val="0"/>
+        </w:rPr>
+        <w:t xml:space="preserve">NetworkPolicies</w:t>
+      </w:r>
+      <w:r>
+        <w:rPr>
+          <w:rtl w:val="0"/>
+        </w:rPr>
+        <w:t xml:space="preserve"> regulan el tráfico de red entre </w:t>
+      </w:r>
+      <w:r>
+        <w:rPr>
+          <w:i w:val="1"/>
+          <w:iCs w:val="1"/>
+          <w:rtl w:val="0"/>
+        </w:rPr>
+        <w:t xml:space="preserve">pods</w:t>
       </w:r>
       <w:r>
         <w:rPr>
@@ -1338,13 +1639,124 @@
           <w:iCs w:val="1"/>
           <w:rtl w:val="0"/>
         </w:rPr>
+        <w:t xml:space="preserve">namespaces</w:t>
+      </w:r>
+      <w:r>
+        <w:rPr>
+          <w:rtl w:val="0"/>
+        </w:rPr>
+        <w:t xml:space="preserve">; la </w:t>
+      </w:r>
+      <w:r>
+        <w:rPr>
+          <w:i w:val="1"/>
+          <w:iCs w:val="1"/>
+          <w:rtl w:val="0"/>
+        </w:rPr>
+        <w:t xml:space="preserve">Pod Security Admission</w:t>
+      </w:r>
+      <w:r>
+        <w:rPr>
+          <w:rtl w:val="0"/>
+        </w:rPr>
+        <w:t xml:space="preserve"> controla las capacidades del sistema operativo accesibles desde los contenedores; y la </w:t>
+      </w:r>
+      <w:r>
+        <w:rPr>
+          <w:i w:val="1"/>
+          <w:iCs w:val="1"/>
+          <w:rtl w:val="0"/>
+        </w:rPr>
+        <w:t xml:space="preserve">Secrets API</w:t>
+      </w:r>
+      <w:r>
+        <w:rPr>
+          <w:rtl w:val="0"/>
+        </w:rPr>
+        <w:t xml:space="preserve"> gestiona la distribución de credenciales hacia las cargas de trabajo. Cada uno de estos mecanismos puede ser objetivo de un experimento de SCE con hipótesis verificables: ¿el RBAC efectivamente impide la escalación de privilegios? ¿Las </w:t>
+      </w:r>
+      <w:r>
+        <w:rPr>
+          <w:i w:val="1"/>
+          <w:iCs w:val="1"/>
+          <w:rtl w:val="0"/>
+        </w:rPr>
+        <w:t xml:space="preserve">NetworkPolicies</w:t>
+      </w:r>
+      <w:r>
+        <w:rPr>
+          <w:rtl w:val="0"/>
+        </w:rPr>
+        <w:t xml:space="preserve"> bloquean el </w:t>
+      </w:r>
+      <w:r>
+        <w:rPr>
+          <w:i w:val="1"/>
+          <w:iCs w:val="1"/>
+          <w:rtl w:val="0"/>
+        </w:rPr>
+        <w:t xml:space="preserve">egress</w:t>
+      </w:r>
+      <w:r>
+        <w:rPr>
+          <w:rtl w:val="0"/>
+        </w:rPr>
+        <w:t xml:space="preserve"> no autorizado? ¿Los secretos no son accesibles fuera del </w:t>
+      </w:r>
+      <w:r>
+        <w:rPr>
+          <w:i w:val="1"/>
+          <w:iCs w:val="1"/>
+          <w:rtl w:val="0"/>
+        </w:rPr>
+        <w:t xml:space="preserve">namespace</w:t>
+      </w:r>
+      <w:r>
+        <w:rPr>
+          <w:rtl w:val="0"/>
+        </w:rPr>
+        <w:t xml:space="preserve"> al que pertenecen? Esta correspondencia directa entre los controles de seguridad de la plataforma y los vectores de experimentación del catálogo no es accidental: es precisamente la razón por la que Kubernetes constituye el entorno más representativo para validar hipótesis de SCE relevantes para la industria.</w:t>
+      </w:r>
+    </w:p>
+    <w:p>
+      <w:pPr>
+        <w:spacing w:after="120" w:before="120" w:line="276" w:lineRule="auto"/>
+        <w:jc w:val="both"/>
+        <w:rPr/>
+      </w:pPr>
+      <w:r>
+        <w:rPr>
+          <w:rtl w:val="0"/>
+        </w:rPr>
+        <w:t xml:space="preserve">El ecosistema de herramientas de inyección de fallos nativas de Kubernetes refuerza esta elección. </w:t>
+      </w:r>
+      <w:r>
+        <w:rPr>
+          <w:i w:val="1"/>
+          <w:iCs w:val="1"/>
+          <w:rtl w:val="0"/>
+        </w:rPr>
+        <w:t xml:space="preserve">LitmusChaos</w:t>
+      </w:r>
+      <w:r>
+        <w:rPr>
+          <w:rtl w:val="0"/>
+        </w:rPr>
+        <w:t xml:space="preserve"> y </w:t>
+      </w:r>
+      <w:r>
+        <w:rPr>
+          <w:i w:val="1"/>
+          <w:iCs w:val="1"/>
+          <w:rtl w:val="0"/>
+        </w:rPr>
         <w:t xml:space="preserve">Chaos Mesh</w:t>
       </w:r>
       <w:r>
         <w:rPr>
           <w:rtl w:val="0"/>
         </w:rPr>
-        <w:t xml:space="preserve"> proveyendo capacidades que van desde la inyección de latencia de red hasta la simulación de fallos de disco y consumo anómalo de CPU.</w:t>
+        <w:t xml:space="preserve">, ambas proyectos graduados o en incubación bajo la CNCF, proveen operadores de Kubernetes que permiten diseñar experimentos como recursos declarativos del clúster, integrables en pipelines de CI/CD y auditables mediante el mismo control de versiones que el resto de la infraestructura [12]. Esta integración nativa elimina la fricción operativa de las herramientas de inyección externas y permite que los experimentos sean integrados fácilmente en el ciclo de vida del software.</w:t>
       </w:r>
     </w:p>
     <w:p>
@@ -1357,517 +1769,7 @@
         <w:rPr>
           <w:rtl w:val="0"/>
         </w:rPr>
-        <w:t xml:space="preserve">Lo que distingue a la Ingeniería del Caos de las pruebas de estrés o de los ejercicios de recuperación ante desastres tradicionales no es la severidad de los fallos que induce, sino el rigor epistemológico con el que los aborda. El proceso parte siempre de una hipótesis formulada en términos de comportamiento observable del sistema: no ¿qué pasa si este servicio cae? sino si este servicio cae, el sistema degradará graciosamente y los usuarios experimentarán latencias menores a x milisegundos sin pérdida de datos. Esta distinción es fundamental porque transforma la experimentación de un ejercicio de descubrimiento ad hoc en un proceso científico reproducible, con criterios de éxito y fracaso definidos de antemano [4].</w:t>
-      </w:r>
-    </w:p>
-    <w:p>
-      <w:pPr>
-        <w:spacing w:after="120" w:before="120" w:line="276" w:lineRule="auto"/>
-        <w:jc w:val="both"/>
-        <w:rPr/>
-      </w:pPr>
-      <w:r>
-        <w:rPr>
-          <w:rtl w:val="0"/>
-        </w:rPr>
-        <w:t xml:space="preserve">Los principios que codifican esta práctica fueron formalizados por Rosenthal et al. [2] y pueden resumirse en cinco postulados: primero, construir una hipótesis sobre el comportamiento en estado estable; segundo, variar eventos del mundo real que puedan afectar ese estado; tercero, ejecutar los experimentos en producción; cuarto, automatizar los experimentos para que se ejecuten continuamente; y quinto, minimizar el radio de explosión para limitar el impacto sobre usuarios reales. La tensión entre el tercer y el quinto principio “ejecutar en producción, pero minimizar el impacto” define gran parte de la madurez operativa necesaria para implementar un programa de Ingeniería del Caos responsable.</w:t>
-      </w:r>
-    </w:p>
-    <w:p>
-      <w:pPr>
-        <w:pStyle w:val="Heading2"/>
-        <w:rPr>
-          <w:color w:val="000000"/>
-        </w:rPr>
-      </w:pPr>
-      <w:r>
-        <w:rPr>
-          <w:color w:val="000000"/>
-          <w:rtl w:val="0"/>
-        </w:rPr>
-        <w:t xml:space="preserve">1.2 De la prevención a la preparación: antifragilidad y sistemas complejos</w:t>
-      </w:r>
-    </w:p>
-    <w:p>
-      <w:pPr>
-        <w:spacing w:after="120" w:before="120" w:line="276" w:lineRule="auto"/>
-        <w:jc w:val="both"/>
-        <w:rPr/>
-      </w:pPr>
-      <w:r>
-        <w:rPr>
-          <w:rtl w:val="0"/>
-        </w:rPr>
-        <w:t xml:space="preserve">Para comprender por qué la SCE representa un avance paradigmático respecto a los enfoques de seguridad convencionales, es necesario examinar dos marcos conceptuales que le dan sustento filosófico: la teoría de la antifragilidad de Nassim Nicholas Taleb y el modelo de comprensión del error humano en sistemas complejos de Sidney Dekker.</w:t>
-      </w:r>
-    </w:p>
-    <w:p>
-      <w:pPr>
-        <w:spacing w:after="120" w:before="120" w:line="276" w:lineRule="auto"/>
-        <w:jc w:val="both"/>
-        <w:rPr/>
-      </w:pPr>
-      <w:r>
-        <w:rPr>
-          <w:rtl w:val="0"/>
-        </w:rPr>
-        <w:t>Taleb propone una clasificación tripartita de los sistemas según su respuesta al desorden: los sistemas frágiles se deterioran con la volatilidad y el estrés; los sistemas robustos resisten sin cambiar; los sistemas antifrágiles mejoran con la exposición al desorden, la variabilidad y el estrés [5]. Esta clasificación tiene implicaciones directas para la seguridad informática. La mayoría de las estrategias de seguridad apuntan a construir sistemas robustos: mantener el estado bajo condiciones adversas mediante la acumulación de capas de controles preventivos. La SCE propone algo más ambicioso: construir sistemas que se vuelvan más seguros precisamente por haber sido expuestos, de forma controlada, a condiciones adversas. Cada experimento ejecutado que revela una debilidad y motiva una remediación convierte al sistema en más resiliente respecto a esa clase de fallo. El programa de SCE, en su conjunto, es un mecanismo de antifragilidad institucionalizado.</w:t>
-      </w:r>
-    </w:p>
-    <w:p>
-      <w:pPr>
-        <w:spacing w:after="120" w:before="120" w:line="276" w:lineRule="auto"/>
-        <w:jc w:val="both"/>
-        <w:rPr/>
-      </w:pPr>
-      <w:r>
-        <w:rPr>
-          <w:rtl w:val="0"/>
-        </w:rPr>
-        <w:t xml:space="preserve">Dekker ofrece una perspectiva igualmente valiosa desde la ergonomía cognitiva y la ingeniería de sistemas complejos. Su modelo </w:t>
-      </w:r>
-      <w:r>
-        <w:rPr>
-          <w:i w:val="1"/>
-          <w:iCs w:val="1"/>
-          <w:rtl w:val="0"/>
-        </w:rPr>
-        <w:t xml:space="preserve">New View</w:t>
-      </w:r>
-      <w:r>
-        <w:rPr>
-          <w:rtl w:val="0"/>
-        </w:rPr>
-        <w:t xml:space="preserve"> sobre el error humano sostiene que los accidentes y fallos en sistemas complejos no son causados por la presencia de componentes defectuosos o actores negligentes, sino por la interacción de elementos que, individualmente, funcionan correctamente [6]. Esta propiedad, denominada en la literatura de seguridad de sistemas como teoría de los accidentes normales, tiene implicaciones directas para la ciberseguridad: los incidentes más graves no suelen ser el resultado de una única vulnerabilidad crítica sino de la convergencia de múltiples configuraciones subóptimas, comportamientos inesperados bajo carga y supuestos incorrectos sobre las dependencias del sistema. Los experimentos de caos están diseñados precisamente para crear las condiciones en las que estas convergencias emergen de forma controlada.</w:t>
-      </w:r>
-    </w:p>
-    <w:p>
-      <w:pPr>
-        <w:spacing w:after="120" w:before="120" w:line="276" w:lineRule="auto"/>
-        <w:jc w:val="both"/>
-        <w:rPr/>
-      </w:pPr>
-      <w:r>
-        <w:rPr>
-          <w:rtl w:val="0"/>
-        </w:rPr>
-        <w:t xml:space="preserve">Este marco conceptual justifica el cambio de paradigma que la SCE propone. Si los fallos son propiedades emergentes de sistemas complejos y no anomalías evitables, entonces la estrategia de seguridad no puede limitarse a fortalecer componentes individuales. Debe, en cambio, verificar empíricamente cómo se comporta el sistema como totalidad cuando esos componentes fallan, y construir sobre esa evidencia una confianza objetiva “no asumida” en su resiliencia.</w:t>
-      </w:r>
-    </w:p>
-    <w:p>
-      <w:pPr>
-        <w:pStyle w:val="Heading2"/>
-        <w:rPr>
-          <w:color w:val="000000"/>
-        </w:rPr>
-      </w:pPr>
-      <w:r>
-        <w:rPr>
-          <w:color w:val="000000"/>
-          <w:rtl w:val="0"/>
-        </w:rPr>
-        <w:t xml:space="preserve">1.3 </w:t>
-      </w:r>
-      <w:r>
-        <w:rPr>
-          <w:i w:val="1"/>
-          <w:iCs w:val="1"/>
-          <w:color w:val="000000"/>
-          <w:rtl w:val="0"/>
-        </w:rPr>
-        <w:t xml:space="preserve">Security Chaos Engineering</w:t>
-      </w:r>
-      <w:r>
-        <w:rPr>
-          <w:color w:val="000000"/>
-          <w:rtl w:val="0"/>
-        </w:rPr>
-        <w:t xml:space="preserve">: definición, alcance y diferenciación</w:t>
-      </w:r>
-    </w:p>
-    <w:p>
-      <w:pPr>
-        <w:spacing w:after="120" w:before="120" w:line="276" w:lineRule="auto"/>
-        <w:jc w:val="both"/>
-        <w:rPr/>
-      </w:pPr>
-      <w:r>
-        <w:rPr>
-          <w:rtl w:val="0"/>
-        </w:rPr>
-        <w:t xml:space="preserve">La </w:t>
-      </w:r>
-      <w:r>
-        <w:rPr>
-          <w:i w:val="1"/>
-          <w:iCs w:val="1"/>
-          <w:rtl w:val="0"/>
-        </w:rPr>
-        <w:t xml:space="preserve">Security Chaos Engineering</w:t>
-      </w:r>
-      <w:r>
-        <w:rPr>
-          <w:rtl w:val="0"/>
-        </w:rPr>
-        <w:t xml:space="preserve"> (SCE) es definida por Shortridge y Rinehart como la aplicación de los principios de la Ingeniería del Caos al dominio de la ciberseguridad, con el objetivo de descubrir debilidades en los controles de seguridad, verificar la efectividad de los mecanismos de detección y respuesta, y generar confianza cuantificable en la resiliencia del sistema frente a condiciones adversas con impacto sobre la seguridad de la información [1].</w:t>
-      </w:r>
-    </w:p>
-    <w:p>
-      <w:pPr>
-        <w:spacing w:after="120" w:before="120" w:line="276" w:lineRule="auto"/>
-        <w:jc w:val="both"/>
-        <w:rPr/>
-      </w:pPr>
-      <w:r>
-        <w:rPr>
-          <w:rtl w:val="0"/>
-        </w:rPr>
-        <w:t xml:space="preserve">Es fundamental delimitar el alcance de la SCE respecto a la Ingeniería del Caos de infraestructura, con la que comparte metodología, pero difiere en objetivos. Un experimento de caos de infraestructura típico podría consistir en terminar nodos de un clúster de Kubernetes y verificar que el orquestador reprograme los </w:t>
-      </w:r>
-      <w:r>
-        <w:rPr>
-          <w:i w:val="1"/>
-          <w:iCs w:val="1"/>
-          <w:rtl w:val="0"/>
-        </w:rPr>
-        <w:t xml:space="preserve">pods</w:t>
-      </w:r>
-      <w:r>
-        <w:rPr>
-          <w:rtl w:val="0"/>
-        </w:rPr>
-        <w:t xml:space="preserve"> correctamente, manteniendo los SLOs de disponibilidad. El objetivo es la continuidad del servicio. Un experimento de SCE, en contraste, podría consistir en simular la exfiltración de credenciales de un </w:t>
-      </w:r>
-      <w:r>
-        <w:rPr>
-          <w:i w:val="1"/>
-          <w:iCs w:val="1"/>
-          <w:rtl w:val="0"/>
-        </w:rPr>
-        <w:t xml:space="preserve">pod</w:t>
-      </w:r>
-      <w:r>
-        <w:rPr>
-          <w:rtl w:val="0"/>
-        </w:rPr>
-        <w:t xml:space="preserve"> comprometido y verificar que los sistemas de detección lo identifiquen, que los mecanismos de rotación de secretos funcionen dentro del tiempo esperado y que el acceso no autorizado sea contenido antes de alcanzar datos sensibles. El objetivo es la seguridad de la información.</w:t>
-      </w:r>
-    </w:p>
-    <w:p>
-      <w:pPr>
-        <w:spacing w:after="120" w:before="120" w:line="276" w:lineRule="auto"/>
-        <w:jc w:val="both"/>
-        <w:rPr/>
-      </w:pPr>
-      <w:r>
-        <w:rPr>
-          <w:rtl w:val="0"/>
-        </w:rPr>
-        <w:t xml:space="preserve">La tríada CIA “Confidencialidad, Integridad y Disponibilidad” constituye el eje organizador de los experimentos en el marco de la SCE. Cada experimento debe poder mapearse hacia uno o más de estos pilares y formular hipótesis verificables sobre el comportamiento de los controles de seguridad correspondientes. Los experimentos de confidencialidad verifican que la información no sea accesible a entidades no autorizadas incluso bajo condiciones de fallo. Los de integridad verifican que los datos no puedan ser modificados o corrompidos sin que los mecanismos de detección lo registren. Los de disponibilidad, en el contexto específico de la SCE, no se limitan a verificar el </w:t>
-      </w:r>
-      <w:r>
-        <w:rPr>
-          <w:i w:val="1"/>
-          <w:iCs w:val="1"/>
-          <w:rtl w:val="0"/>
-        </w:rPr>
-        <w:t xml:space="preserve">uptime</w:t>
-      </w:r>
-      <w:r>
-        <w:rPr>
-          <w:rtl w:val="0"/>
-        </w:rPr>
-        <w:t xml:space="preserve"> del servicio sino la disponibilidad de la información para usuarios autorizados incluso cuando los sistemas de autenticación o autorización experimentan fallos parciales.</w:t>
-      </w:r>
-    </w:p>
-    <w:p>
-      <w:pPr>
-        <w:spacing w:after="120" w:before="120" w:line="276" w:lineRule="auto"/>
-        <w:jc w:val="both"/>
-        <w:rPr/>
-      </w:pPr>
-      <w:r>
-        <w:rPr>
-          <w:rtl w:val="0"/>
-        </w:rPr>
-        <w:t xml:space="preserve">La relación entre la SCE y el </w:t>
-      </w:r>
-      <w:r>
-        <w:rPr>
-          <w:i w:val="1"/>
-          <w:iCs w:val="1"/>
-          <w:rtl w:val="0"/>
-        </w:rPr>
-        <w:t xml:space="preserve">Site Reliability Engineering</w:t>
-      </w:r>
-      <w:r>
-        <w:rPr>
-          <w:rtl w:val="0"/>
-        </w:rPr>
-        <w:t xml:space="preserve"> merece una mención particular. Beyer et al. establecen que el SRE define la confiabilidad como una propiedad del sistema que debe ser medida, presupuestada y gestionada mediante </w:t>
-      </w:r>
-      <w:r>
-        <w:rPr>
-          <w:i w:val="1"/>
-          <w:iCs w:val="1"/>
-          <w:rtl w:val="0"/>
-        </w:rPr>
-        <w:t xml:space="preserve">error budgets</w:t>
-      </w:r>
-      <w:r>
-        <w:rPr>
-          <w:rtl w:val="0"/>
-        </w:rPr>
-        <w:t xml:space="preserve"> [3]. La SCE puede entenderse como la extensión natural de esta filosofía al dominio de la seguridad: así como el SRE utiliza el </w:t>
-      </w:r>
-      <w:r>
-        <w:rPr>
-          <w:i w:val="1"/>
-          <w:iCs w:val="1"/>
-          <w:rtl w:val="0"/>
-        </w:rPr>
-        <w:t xml:space="preserve">error budget</w:t>
-      </w:r>
-      <w:r>
-        <w:rPr>
-          <w:rtl w:val="0"/>
-        </w:rPr>
-        <w:t xml:space="preserve"> para gestionar el riesgo de disponibilidad, la SCE propone un presupuesto de resiliencia de seguridad que cuantifica el nivel de confianza en los controles basado en evidencia experimental. Ambas disciplinas comparten la convicción de que la confianza no declarada, sino medida, es la única confianza válida en sistemas de producción [3].</w:t>
-      </w:r>
-    </w:p>
-    <w:p>
-      <w:pPr>
-        <w:pStyle w:val="Heading2"/>
-        <w:rPr>
-          <w:color w:val="000000"/>
-        </w:rPr>
-      </w:pPr>
-      <w:r>
-        <w:rPr>
-          <w:color w:val="000000"/>
-          <w:rtl w:val="0"/>
-        </w:rPr>
-        <w:t xml:space="preserve">1.4 Justificación del uso de Kubernetes como plataforma experimental</w:t>
-      </w:r>
-    </w:p>
-    <w:p>
-      <w:pPr>
-        <w:spacing w:after="120" w:before="120" w:line="276" w:lineRule="auto"/>
-        <w:jc w:val="both"/>
-        <w:rPr/>
-      </w:pPr>
-      <w:r>
-        <w:rPr>
-          <w:rtl w:val="0"/>
-        </w:rPr>
-        <w:t xml:space="preserve">La selección de una plataforma de orquestación de contenedores como entorno de referencia para el diseño y la ejecución de experimentos de SCE no es una decisión tecnológica arbitraria, sino una consecuencia directa de las condiciones que caracterizan los entornos de producción modernos. Kubernetes (K8s) se ha consolidado como el estándar de facto en la industria para la orquestación de cargas de trabajo en contenedores: según la encuesta anual de la </w:t>
-      </w:r>
-      <w:r>
-        <w:rPr>
-          <w:i w:val="1"/>
-          <w:iCs w:val="1"/>
-          <w:rtl w:val="0"/>
-        </w:rPr>
-        <w:t xml:space="preserve">Cloud Native Computing Foundation</w:t>
-      </w:r>
-      <w:r>
-        <w:rPr>
-          <w:rtl w:val="0"/>
-        </w:rPr>
-        <w:t xml:space="preserve"> correspondiente a 2023, el 96% de las organizaciones encuestadas utilizan o evalúan Kubernetes en sus entornos productivos [11]. Esta adopción masiva implica que un marco metodológico de SCE diseñado sobre K8s tiene aplicabilidad directa en la gran mayoría de las organizaciones que operan arquitecturas de microservicios, lo que maximiza la relevancia práctica del catálogo de experimentos propuesto.</w:t>
-      </w:r>
-    </w:p>
-    <w:p>
-      <w:pPr>
-        <w:spacing w:after="120" w:before="120" w:line="276" w:lineRule="auto"/>
-        <w:jc w:val="both"/>
-        <w:rPr/>
-      </w:pPr>
-      <w:r>
-        <w:rPr>
-          <w:rtl w:val="0"/>
-        </w:rPr>
-        <w:t xml:space="preserve">Más allá de su prevalencia, Kubernetes presenta propiedades estructurales que lo convierten en la plataforma ideal para la experimentación en seguridad. Su modelo de seguridad nativo está construido sobre primitivas que son, al mismo tiempo, objetos de validación experimental y vectores de ataque documentados en marcos adversariales como MITRE ATT&amp;CK for Containers [7]. El Control de Acceso Basado en Roles (RBAC) define qué </w:t>
-      </w:r>
-      <w:r>
-        <w:rPr>
-          <w:i w:val="1"/>
-          <w:iCs w:val="1"/>
-          <w:rtl w:val="0"/>
-        </w:rPr>
-        <w:t xml:space="preserve">ServiceAccounts</w:t>
-      </w:r>
-      <w:r>
-        <w:rPr>
-          <w:rtl w:val="0"/>
-        </w:rPr>
-        <w:t xml:space="preserve"> pueden realizar qué operaciones sobre qué recursos de la API; las </w:t>
-      </w:r>
-      <w:r>
-        <w:rPr>
-          <w:i w:val="1"/>
-          <w:iCs w:val="1"/>
-          <w:rtl w:val="0"/>
-        </w:rPr>
-        <w:t xml:space="preserve">NetworkPolicies</w:t>
-      </w:r>
-      <w:r>
-        <w:rPr>
-          <w:rtl w:val="0"/>
-        </w:rPr>
-        <w:t xml:space="preserve"> regulan el tráfico de red entre </w:t>
-      </w:r>
-      <w:r>
-        <w:rPr>
-          <w:i w:val="1"/>
-          <w:iCs w:val="1"/>
-          <w:rtl w:val="0"/>
-        </w:rPr>
-        <w:t xml:space="preserve">pods</w:t>
-      </w:r>
-      <w:r>
-        <w:rPr>
-          <w:rtl w:val="0"/>
-        </w:rPr>
-        <w:t xml:space="preserve"> y </w:t>
-      </w:r>
-      <w:r>
-        <w:rPr>
-          <w:i w:val="1"/>
-          <w:iCs w:val="1"/>
-          <w:rtl w:val="0"/>
-        </w:rPr>
-        <w:t xml:space="preserve">namespaces</w:t>
-      </w:r>
-      <w:r>
-        <w:rPr>
-          <w:rtl w:val="0"/>
-        </w:rPr>
-        <w:t xml:space="preserve">; la </w:t>
-      </w:r>
-      <w:r>
-        <w:rPr>
-          <w:i w:val="1"/>
-          <w:iCs w:val="1"/>
-          <w:rtl w:val="0"/>
-        </w:rPr>
-        <w:t xml:space="preserve">Pod Security Admission</w:t>
-      </w:r>
-      <w:r>
-        <w:rPr>
-          <w:rtl w:val="0"/>
-        </w:rPr>
-        <w:t xml:space="preserve"> controla las capacidades del sistema operativo accesibles desde los contenedores; y la </w:t>
-      </w:r>
-      <w:r>
-        <w:rPr>
-          <w:i w:val="1"/>
-          <w:iCs w:val="1"/>
-          <w:rtl w:val="0"/>
-        </w:rPr>
-        <w:t xml:space="preserve">Secrets API</w:t>
-      </w:r>
-      <w:r>
-        <w:rPr>
-          <w:rtl w:val="0"/>
-        </w:rPr>
-        <w:t xml:space="preserve"> gestiona la distribución de credenciales hacia las cargas de trabajo. Cada uno de estos mecanismos puede ser objetivo de un experimento de SCE con hipótesis verificables: ¿el RBAC efectivamente impide la escalación de privilegios? ¿Las </w:t>
-      </w:r>
-      <w:r>
-        <w:rPr>
-          <w:i w:val="1"/>
-          <w:iCs w:val="1"/>
-          <w:rtl w:val="0"/>
-        </w:rPr>
-        <w:t xml:space="preserve">NetworkPolicies</w:t>
-      </w:r>
-      <w:r>
-        <w:rPr>
-          <w:rtl w:val="0"/>
-        </w:rPr>
-        <w:t xml:space="preserve"> bloquean el </w:t>
-      </w:r>
-      <w:r>
-        <w:rPr>
-          <w:i w:val="1"/>
-          <w:iCs w:val="1"/>
-          <w:rtl w:val="0"/>
-        </w:rPr>
-        <w:t xml:space="preserve">egress</w:t>
-      </w:r>
-      <w:r>
-        <w:rPr>
-          <w:rtl w:val="0"/>
-        </w:rPr>
-        <w:t xml:space="preserve"> no autorizado? ¿Los secretos no son accesibles fuera del </w:t>
-      </w:r>
-      <w:r>
-        <w:rPr>
-          <w:i w:val="1"/>
-          <w:iCs w:val="1"/>
-          <w:rtl w:val="0"/>
-        </w:rPr>
-        <w:t xml:space="preserve">namespace</w:t>
-      </w:r>
-      <w:r>
-        <w:rPr>
-          <w:rtl w:val="0"/>
-        </w:rPr>
-        <w:t xml:space="preserve"> al que pertenecen? Esta correspondencia directa entre los controles de seguridad de la plataforma y los vectores de experimentación del catálogo no es accidental: es precisamente la razón por la que Kubernetes constituye el entorno más representativo para validar hipótesis de SCE relevantes para la industria.</w:t>
-      </w:r>
-    </w:p>
-    <w:p>
-      <w:pPr>
-        <w:spacing w:after="120" w:before="120" w:line="276" w:lineRule="auto"/>
-        <w:jc w:val="both"/>
-        <w:rPr/>
-      </w:pPr>
-      <w:r>
-        <w:rPr>
-          <w:rtl w:val="0"/>
-        </w:rPr>
-        <w:t xml:space="preserve">El ecosistema de herramientas de inyección de fallos nativas de Kubernetes refuerza esta elección. </w:t>
-      </w:r>
-      <w:r>
-        <w:rPr>
-          <w:i w:val="1"/>
-          <w:iCs w:val="1"/>
-          <w:rtl w:val="0"/>
-        </w:rPr>
-        <w:t xml:space="preserve">LitmusChaos</w:t>
-      </w:r>
-      <w:r>
-        <w:rPr>
-          <w:rtl w:val="0"/>
-        </w:rPr>
-        <w:t xml:space="preserve"> y </w:t>
-      </w:r>
-      <w:r>
-        <w:rPr>
-          <w:i w:val="1"/>
-          <w:iCs w:val="1"/>
-          <w:rtl w:val="0"/>
-        </w:rPr>
-        <w:t xml:space="preserve">Chaos Mesh</w:t>
-      </w:r>
-      <w:r>
-        <w:rPr>
-          <w:rtl w:val="0"/>
-        </w:rPr>
-        <w:t xml:space="preserve">, ambas proyectos graduados o en incubación bajo la CNCF, proveen operadores de Kubernetes que permiten diseñar experimentos como recursos declarativos del clúster, integrables en pipelines de CI/CD y auditables mediante el mismo control de versiones que el resto de la infraestructura [12]. Esta integración nativa elimina la fricción operativa de las herramientas de inyección externas y permite que los experimentos sean integrados fácilmente en el ciclo de vida del software.</w:t>
-      </w:r>
-    </w:p>
-    <w:p>
-      <w:pPr>
-        <w:spacing w:after="120" w:before="120" w:line="276" w:lineRule="auto"/>
-        <w:jc w:val="both"/>
-        <w:rPr/>
-      </w:pPr>
-      <w:r>
-        <w:rPr>
-          <w:rtl w:val="0"/>
-        </w:rPr>
-        <w:t xml:space="preserve">Finalmente, la arquitectura declarativa de Kubernetes, basada en manifiestos que describen el estado deseado del sistema, aporta una propiedad de valor científico fundamental: la reproducibilidad. Dado que el estado completo del entorno experimental puede expresarse como un conjunto de manifiestos versionados en un repositorio </w:t>
+        <w:t xml:space="preserve">Finalmente, la arquitectura declarativa de Kubernetes aporta reproducibilidad experimental: el estado completo del entorno puede expresarse como manifiestos versionados en </w:t>
       </w:r>
       <w:r>
         <w:rPr>
@@ -1881,7 +1783,7 @@
         <w:rPr>
           <w:rtl w:val="0"/>
         </w:rPr>
-        <w:t xml:space="preserve">, es posible recrear con exactitud las condiciones de cualquier experimento anterior, comparar resultados entre ejecuciones y garantizar que las remediaciones aplicadas no han degradado otros controles. Esta reproducibilidad es un requisito implícito del método experimental y raramente se alcanza con entornos configurados de forma imperativa. Por estas razones, Kubernetes constituye no solo la plataforma tecnológicamente más relevante, sino también la más adecuada desde una perspectiva metodológica para la construcción y validación del marco de SCE propuesto en este trabajo.</w:t>
+        <w:t xml:space="preserve">, lo que permite recrear con exactitud cualquier experimento anterior y comparar resultados entre ejecuciones. Por estas razones, Kubernetes constituye la plataforma más adecuada para la construcción y validación del marco de SCE propuesto.</w:t>
       </w:r>
     </w:p>
     <w:p>
@@ -8361,33 +8263,7 @@
         <w:rPr>
           <w:rtl w:val="0"/>
         </w:rPr>
-        <w:t xml:space="preserve">El cambio de paradigma propuesto “de la prevención a la preparación, del control declarado al control demostrado, de la seguridad asumida a la resiliencia medida” no es únicamente una cuestión técnica sino también cultural y organizacional. La Ingeniería del Caos de Seguridad requiere equipos dispuestos a demostrar que sus controles fallan, en lugar de asumir que funcionan.</w:t>
-      </w:r>
-    </w:p>
-    <w:p>
-      <w:pPr>
-        <w:spacing w:after="120" w:before="120" w:line="276" w:lineRule="auto"/>
-        <w:jc w:val="both"/>
-        <w:rPr/>
-      </w:pPr>
-      <w:r>
-        <w:rPr>
-          <w:rtl w:val="0"/>
-        </w:rPr>
-        <w:t xml:space="preserve">Como líneas de trabajo futuro se identifican tres direcciones prioritarias: la integración del catálogo de experimentos con los marcos de adversario MITRE ATT&amp;CK y MITRE D3FEND para asegurar cobertura sistemática; la automatización completa del ciclo de vida de los experimentos mediante pipelines de CI/CD que ejecuten experimentos de seguridad de manera continua como parte del proceso de entrega; y la exploración de la aplicabilidad del marco en entornos de infraestructura crítica, donde el diseño del radio de explosión presenta desafíos cualitativamente distintos a los del software comercial.</w:t>
-      </w:r>
-    </w:p>
-    <w:p>
-      <w:pPr>
-        <w:spacing w:after="120" w:before="120" w:line="276" w:lineRule="auto"/>
-        <w:jc w:val="both"/>
-        <w:rPr/>
-      </w:pPr>
-      <w:r>
-        <w:rPr>
-          <w:rtl w:val="0"/>
-        </w:rPr>
-        <w:t xml:space="preserve">En definitiva, la Ingeniería del Caos de Seguridad no es una herramienta para encontrar vulnerabilidades: es una disciplina para construir confianza. Las vulnerabilidades encontradas son un subproducto; el producto real es el conocimiento empírico, profundo y actualizado de cómo se comporta el sistema cuando las cosas fallan. Ese conocimiento es el único fundamento sólido sobre el que puede construirse una postura de seguridad genuinamente resiliente.</w:t>
+        <w:t xml:space="preserve">Como líneas de trabajo futuro se identifican: la integración del catálogo con MITRE ATT&amp;CK y D3FEND para cobertura sistemática; la automatización del ciclo de vida mediante pipelines de CI/CD; y la exploración del marco en entornos de infraestructura crítica.</w:t>
       </w:r>
     </w:p>
     <w:p>

</xml_diff>

<commit_message>
Switch table and figure references from APA to IEEE format
Tables: TABLA I/II/III (bold) + small-caps title, "Nota." → "Fuente: Elaboración propia, 2026."
Figures: Fig. N. (bold) + plain description + [Fuente: Elaboración propia, 2026.]

Co-Authored-By: Claude Sonnet 4.6 <noreply@anthropic.com>
</commit_message>
<xml_diff>
--- a/Trabajo_Final_Moncada_SCE_v2.docx
+++ b/Trabajo_Final_Moncada_SCE_v2.docx
@@ -3663,7 +3663,7 @@
         <w:rPr>
           <w:b/>
         </w:rPr>
-        <w:t>Tabla 1</w:t>
+        <w:t>TABLA I</w:t>
       </w:r>
     </w:p>
     <w:p>
@@ -3673,7 +3673,7 @@
       </w:pPr>
       <w:r>
         <w:rPr>
-          <w:i/>
+          <w:caps/>
         </w:rPr>
         <w:t>Catálogo de experimentos SCE: dimensión CIA, nivel de riesgo y herramienta de detección principal</w:t>
       </w:r>
@@ -5176,18 +5176,12 @@
     </w:tbl>
     <w:p>
       <w:pPr>
-        <w:spacing w:after="120" w:before="60" w:line="276" w:lineRule="auto"/>
-        <w:rPr/>
-      </w:pPr>
-      <w:r>
-        <w:rPr>
-          <w:i/>
-        </w:rPr>
-        <w:t xml:space="preserve">Nota. </w:t>
-      </w:r>
-      <w:r>
-        <w:rPr/>
-        <w:t>Elaboración propia (2026).</w:t>
+        <w:spacing w:after="120" w:before="40" w:line="276" w:lineRule="auto"/>
+        <w:rPr/>
+      </w:pPr>
+      <w:r>
+        <w:rPr/>
+        <w:t>Fuente: Elaboración propia, 2026.</w:t>
       </w:r>
     </w:p>
     <w:p>
@@ -5504,13 +5498,13 @@
       </w:pPr>
       <w:r>
         <w:rPr>
-          <w:i/>
-        </w:rPr>
-        <w:t xml:space="preserve">Figura 1. </w:t>
-      </w:r>
-      <w:r>
-        <w:rPr/>
-        <w:t>Salida de consola del experimento SCE-C-001 — Confidencialidad: detección de credenciales expuestas en variables de entorno y bloqueo de exfiltración de red y DNS. Elaboración propia (2026).</w:t>
+          <w:b/>
+        </w:rPr>
+        <w:t xml:space="preserve">Fig. 1. </w:t>
+      </w:r>
+      <w:r>
+        <w:rPr/>
+        <w:t>Salida de consola del experimento SCE-C-001 — Confidencialidad: detección de credenciales expuestas en variables de entorno y bloqueo de exfiltración de red y DNS. [Fuente: Elaboración propia, 2026.]</w:t>
       </w:r>
     </w:p>
     <w:p>
@@ -5568,13 +5562,13 @@
       </w:pPr>
       <w:r>
         <w:rPr>
-          <w:i/>
-        </w:rPr>
-        <w:t xml:space="preserve">Figura 2. </w:t>
-      </w:r>
-      <w:r>
-        <w:rPr/>
-        <w:t>Vistas k9s del clúster sce-lab durante la ejecución de los tres experimentos SCE: estado de pods, políticas de red activas y hallazgos de seguridad detectados por experimento. Elaboración propia (2026).</w:t>
+          <w:b/>
+        </w:rPr>
+        <w:t xml:space="preserve">Fig. 2. </w:t>
+      </w:r>
+      <w:r>
+        <w:rPr/>
+        <w:t>Vistas k9s del clúster sce-lab durante la ejecución de los tres experimentos SCE: estado de pods, políticas de red activas y hallazgos de seguridad detectados por experimento. [Fuente: Elaboración propia, 2026.]</w:t>
       </w:r>
     </w:p>
     <w:p>
@@ -5632,13 +5626,13 @@
       </w:pPr>
       <w:r>
         <w:rPr>
-          <w:i/>
-        </w:rPr>
-        <w:t xml:space="preserve">Figura 3. </w:t>
-      </w:r>
-      <w:r>
-        <w:rPr/>
-        <w:t>Salida de consola del experimento SCE-D-001 — Disponibilidad: verificación del comportamiento fail-secure del servicio de autenticación ante escenario de escala-a-cero. Elaboración propia (2026).</w:t>
+          <w:b/>
+        </w:rPr>
+        <w:t xml:space="preserve">Fig. 3. </w:t>
+      </w:r>
+      <w:r>
+        <w:rPr/>
+        <w:t>Salida de consola del experimento SCE-D-001 — Disponibilidad: verificación del comportamiento fail-secure del servicio de autenticación ante escenario de escala-a-cero. [Fuente: Elaboración propia, 2026.]</w:t>
       </w:r>
     </w:p>
     <w:p>
@@ -5716,7 +5710,7 @@
         <w:rPr>
           <w:b/>
         </w:rPr>
-        <w:t>Tabla 2</w:t>
+        <w:t>TABLA II</w:t>
       </w:r>
     </w:p>
     <w:p>
@@ -5726,7 +5720,7 @@
       </w:pPr>
       <w:r>
         <w:rPr>
-          <w:i/>
+          <w:caps/>
         </w:rPr>
         <w:t>Resultados del experimento SCE-C-001: acciones de inyección, observaciones y evaluación de controles de seguridad</w:t>
       </w:r>
@@ -6665,18 +6659,12 @@
     </w:tbl>
     <w:p>
       <w:pPr>
-        <w:spacing w:after="120" w:before="60" w:line="276" w:lineRule="auto"/>
-        <w:rPr/>
-      </w:pPr>
-      <w:r>
-        <w:rPr>
-          <w:i/>
-        </w:rPr>
-        <w:t xml:space="preserve">Nota. </w:t>
-      </w:r>
-      <w:r>
-        <w:rPr/>
-        <w:t>Elaboración propia (2026).</w:t>
+        <w:spacing w:after="120" w:before="40" w:line="276" w:lineRule="auto"/>
+        <w:rPr/>
+      </w:pPr>
+      <w:r>
+        <w:rPr/>
+        <w:t>Fuente: Elaboración propia, 2026.</w:t>
       </w:r>
     </w:p>
     <w:p>
@@ -6772,13 +6760,13 @@
       </w:pPr>
       <w:r>
         <w:rPr>
-          <w:i/>
-        </w:rPr>
-        <w:t xml:space="preserve">Figura 4. </w:t>
-      </w:r>
-      <w:r>
-        <w:rPr/>
-        <w:t>Salida de consola del experimento SCE-I-002 — Integridad: bloqueo de escritura en /var/log, detección de inyección stdout vía /proc/1/fd/1 y protección del host de auditoría. Elaboración propia (2026).</w:t>
+          <w:b/>
+        </w:rPr>
+        <w:t xml:space="preserve">Fig. 4. </w:t>
+      </w:r>
+      <w:r>
+        <w:rPr/>
+        <w:t>Salida de consola del experimento SCE-I-002 — Integridad: bloqueo de escritura en /var/log, detección de inyección stdout vía /proc/1/fd/1 y protección del host de auditoría. [Fuente: Elaboración propia, 2026.]</w:t>
       </w:r>
     </w:p>
     <w:p>
@@ -7009,7 +6997,7 @@
         <w:rPr>
           <w:b/>
         </w:rPr>
-        <w:t>Tabla 3</w:t>
+        <w:t>TABLA III</w:t>
       </w:r>
     </w:p>
     <w:p>
@@ -7019,7 +7007,7 @@
       </w:pPr>
       <w:r>
         <w:rPr>
-          <w:i/>
+          <w:caps/>
         </w:rPr>
         <w:t>Análisis consolidado de resultados: hipótesis evaluadas, hallazgos secundarios y veredicto por experimento SCE</w:t>
       </w:r>
@@ -7958,18 +7946,12 @@
     </w:tbl>
     <w:p>
       <w:pPr>
-        <w:spacing w:after="120" w:before="60" w:line="276" w:lineRule="auto"/>
-        <w:rPr/>
-      </w:pPr>
-      <w:r>
-        <w:rPr>
-          <w:i/>
-        </w:rPr>
-        <w:t xml:space="preserve">Nota. </w:t>
-      </w:r>
-      <w:r>
-        <w:rPr/>
-        <w:t>Elaboración propia (2026).</w:t>
+        <w:spacing w:after="120" w:before="40" w:line="276" w:lineRule="auto"/>
+        <w:rPr/>
+      </w:pPr>
+      <w:r>
+        <w:rPr/>
+        <w:t>Fuente: Elaboración propia, 2026.</w:t>
       </w:r>
     </w:p>
     <w:p>

</xml_diff>

<commit_message>
Relocate figures to correct experiment sections
- Fig. 1 (console SCE-C-001) → stays in §4.2
- Fig. 2 (console SCE-I-002) → moved into §4.3
- Fig. 3 (console SCE-D-001) → moved into §4.4
- Fig. 4 (k9s all experiments) → moved into §4.5 after Table III

Co-Authored-By: Claude Sonnet 4.6 <noreply@anthropic.com>
</commit_message>
<xml_diff>
--- a/Trabajo_Final_Moncada_SCE_v2.docx
+++ b/Trabajo_Final_Moncada_SCE_v2.docx
@@ -5514,134 +5514,6 @@
         <w:rPr/>
       </w:pPr>
       <w:r>
-        <w:rPr/>
-        <w:drawing>
-          <wp:inline distB="114300" distT="114300" distL="114300" distR="114300">
-            <wp:extent cx="5502600" cy="3537385"/>
-            <wp:effectExtent b="0" l="0" r="0" t="0"/>
-            <wp:docPr id="4" name="image4.png"/>
-            <a:graphic>
-              <a:graphicData uri="http://schemas.openxmlformats.org/drawingml/2006/picture">
-                <pic:pic>
-                  <pic:nvPicPr>
-                    <pic:cNvPr id="0" name="image4.png"/>
-                    <pic:cNvPicPr preferRelativeResize="0"/>
-                  </pic:nvPicPr>
-                  <pic:blipFill>
-                    <a:blip r:embed="rId10"/>
-                    <a:srcRect b="0" l="0" r="0" t="0"/>
-                    <a:stretch>
-                      <a:fillRect/>
-                    </a:stretch>
-                  </pic:blipFill>
-                  <pic:spPr>
-                    <a:xfrm>
-                      <a:off x="0" y="0"/>
-                      <a:ext cx="5502600" cy="3537385"/>
-                    </a:xfrm>
-                    <a:prstGeom prst="rect"/>
-                    <a:ln/>
-                  </pic:spPr>
-                </pic:pic>
-              </a:graphicData>
-            </a:graphic>
-          </wp:inline>
-        </w:drawing>
-      </w:r>
-      <w:r>
-        <w:rPr>
-          <w:rtl w:val="0"/>
-        </w:rPr>
-      </w:r>
-    </w:p>
-    <w:p>
-      <w:pPr>
-        <w:spacing w:after="160" w:before="60" w:line="276" w:lineRule="auto"/>
-        <w:jc w:val="center"/>
-        <w:rPr/>
-      </w:pPr>
-      <w:r>
-        <w:rPr>
-          <w:b/>
-        </w:rPr>
-        <w:t xml:space="preserve">Fig. 2. </w:t>
-      </w:r>
-      <w:r>
-        <w:rPr/>
-        <w:t>Vistas k9s del clúster sce-lab durante la ejecución de los tres experimentos SCE: estado de pods, políticas de red activas y hallazgos de seguridad detectados por experimento. [Fuente: Elaboración propia, 2026.]</w:t>
-      </w:r>
-    </w:p>
-    <w:p>
-      <w:pPr>
-        <w:spacing w:after="120" w:before="120" w:line="276" w:lineRule="auto"/>
-        <w:jc w:val="both"/>
-        <w:rPr/>
-      </w:pPr>
-      <w:r>
-        <w:rPr/>
-        <w:drawing>
-          <wp:inline distB="114300" distT="114300" distL="114300" distR="114300">
-            <wp:extent cx="5502600" cy="3537385"/>
-            <wp:effectExtent b="0" l="0" r="0" t="0"/>
-            <wp:docPr id="3" name="image2.png"/>
-            <a:graphic>
-              <a:graphicData uri="http://schemas.openxmlformats.org/drawingml/2006/picture">
-                <pic:pic>
-                  <pic:nvPicPr>
-                    <pic:cNvPr id="0" name="image2.png"/>
-                    <pic:cNvPicPr preferRelativeResize="0"/>
-                  </pic:nvPicPr>
-                  <pic:blipFill>
-                    <a:blip r:embed="rId11"/>
-                    <a:srcRect b="0" l="0" r="0" t="0"/>
-                    <a:stretch>
-                      <a:fillRect/>
-                    </a:stretch>
-                  </pic:blipFill>
-                  <pic:spPr>
-                    <a:xfrm>
-                      <a:off x="0" y="0"/>
-                      <a:ext cx="5502600" cy="3537385"/>
-                    </a:xfrm>
-                    <a:prstGeom prst="rect"/>
-                    <a:ln/>
-                  </pic:spPr>
-                </pic:pic>
-              </a:graphicData>
-            </a:graphic>
-          </wp:inline>
-        </w:drawing>
-      </w:r>
-      <w:r>
-        <w:rPr>
-          <w:rtl w:val="0"/>
-        </w:rPr>
-      </w:r>
-    </w:p>
-    <w:p>
-      <w:pPr>
-        <w:spacing w:after="160" w:before="60" w:line="276" w:lineRule="auto"/>
-        <w:jc w:val="center"/>
-        <w:rPr/>
-      </w:pPr>
-      <w:r>
-        <w:rPr>
-          <w:b/>
-        </w:rPr>
-        <w:t xml:space="preserve">Fig. 3. </w:t>
-      </w:r>
-      <w:r>
-        <w:rPr/>
-        <w:t>Salida de consola del experimento SCE-D-001 — Disponibilidad: verificación del comportamiento fail-secure del servicio de autenticación ante escenario de escala-a-cero. [Fuente: Elaboración propia, 2026.]</w:t>
-      </w:r>
-    </w:p>
-    <w:p>
-      <w:pPr>
-        <w:spacing w:after="120" w:before="120" w:line="276" w:lineRule="auto"/>
-        <w:jc w:val="both"/>
-        <w:rPr/>
-      </w:pPr>
-      <w:r>
         <w:rPr>
           <w:rtl w:val="0"/>
         </w:rPr>
@@ -6707,6 +6579,116 @@
     </w:p>
     <w:p>
       <w:pPr>
+        <w:pStyle w:val="Heading2"/>
+        <w:rPr>
+          <w:color w:val="000000"/>
+        </w:rPr>
+      </w:pPr>
+      <w:r>
+        <w:rPr>
+          <w:color w:val="000000"/>
+          <w:rtl w:val="0"/>
+        </w:rPr>
+        <w:t xml:space="preserve">4.3 PoC-002: Corrupción de registros de auditoría (SCE-I-002)</w:t>
+      </w:r>
+    </w:p>
+    <w:p>
+      <w:pPr>
+        <w:spacing w:after="120" w:before="120" w:line="276" w:lineRule="auto"/>
+        <w:jc w:val="both"/>
+        <w:rPr/>
+      </w:pPr>
+      <w:r>
+        <w:rPr>
+          <w:rtl w:val="0"/>
+        </w:rPr>
+        <w:t xml:space="preserve">Se ejecutó el experimento SCE-I-002 para validar la integridad del sistema de logging. El entorno utiliza Fluentd como DaemonSet para recopilación de logs y los envía a Elasticsearch con verificación de integridad mediante hashes SHA-256 calculados en origen. Los logs se retienen en el nodo de origen durante 24 horas antes de eliminarse.</w:t>
+      </w:r>
+    </w:p>
+    <w:p>
+      <w:pPr>
+        <w:spacing w:after="120" w:before="120" w:line="276" w:lineRule="auto"/>
+        <w:jc w:val="both"/>
+        <w:rPr/>
+      </w:pPr>
+      <w:r>
+        <w:rPr>
+          <w:rtl w:val="0"/>
+        </w:rPr>
+        <w:t xml:space="preserve">La inyección consistió en intentar, desde un pod de aplicación con credenciales de nivel de servicio: escribir directamente en el directorio /var/log/containers del nodo (bloqueado por el Security Context del pod que deshabilita privilegios y </w:t>
+      </w:r>
+      <w:r>
+        <w:rPr>
+          <w:i w:val="1"/>
+          <w:iCs w:val="1"/>
+          <w:rtl w:val="0"/>
+        </w:rPr>
+        <w:t xml:space="preserve">runAsNonRoot</w:t>
+      </w:r>
+      <w:r>
+        <w:rPr>
+          <w:rtl w:val="0"/>
+        </w:rPr>
+        <w:t xml:space="preserve">: true); intentar modificar la configuración del DaemonSet de Fluentd mediante kubectl con el </w:t>
+      </w:r>
+      <w:r>
+        <w:rPr>
+          <w:i w:val="1"/>
+          <w:iCs w:val="1"/>
+          <w:rtl w:val="0"/>
+        </w:rPr>
+        <w:t xml:space="preserve">ServiceAccount</w:t>
+      </w:r>
+      <w:r>
+        <w:rPr>
+          <w:rtl w:val="0"/>
+        </w:rPr>
+        <w:t xml:space="preserve"> del pod de aplicación (rechazado con error 403, ya que el RBAC no otorga permisos de escritura sobre </w:t>
+      </w:r>
+      <w:r>
+        <w:rPr>
+          <w:i w:val="1"/>
+          <w:iCs w:val="1"/>
+          <w:rtl w:val="0"/>
+        </w:rPr>
+        <w:t xml:space="preserve">DaemonSets</w:t>
+      </w:r>
+      <w:r>
+        <w:rPr>
+          <w:rtl w:val="0"/>
+        </w:rPr>
+        <w:t xml:space="preserve"> al </w:t>
+      </w:r>
+      <w:r>
+        <w:rPr>
+          <w:i w:val="1"/>
+          <w:iCs w:val="1"/>
+          <w:rtl w:val="0"/>
+        </w:rPr>
+        <w:t xml:space="preserve">ServiceAccount</w:t>
+      </w:r>
+      <w:r>
+        <w:rPr>
+          <w:rtl w:val="0"/>
+        </w:rPr>
+        <w:t xml:space="preserve"> de aplicación); intentar acceder a la API de Elasticsearch directamente para eliminar índices (rechazado: la política de red no permite egress desde el namespace de aplicación hacia el namespace de infraestructura).</w:t>
+      </w:r>
+    </w:p>
+    <w:p>
+      <w:pPr>
+        <w:spacing w:after="120" w:before="120" w:line="276" w:lineRule="auto"/>
+        <w:jc w:val="both"/>
+        <w:rPr/>
+      </w:pPr>
+      <w:r>
+        <w:rPr>
+          <w:rtl w:val="0"/>
+        </w:rPr>
+        <w:t xml:space="preserve">La hipótesis fue confirmada en los vectores de escritura directa y acceso a Elasticsearch. Sin embargo, el experimento reveló un hallazgo significativo en la Fase 2 (166 ms): es posible inyectar líneas falsas en el flujo de logs escribiendo directamente al descriptor de archivo /proc/1/fd/1 del proceso principal del contenedor (stdout), sin necesidad de privilegios adicionales. La línea inyectada “{“level”:“INFO”,“msg”:“legitimate-looking-but-fake”,“user”:“admin”,“action”:“login_success”}” fue recogida por Fluentd y enviada a Elasticsearch, donde quedó registrada como un evento legítimo. Este hallazgo es significativo: aunque el atacante no puede eliminar registros reales (Elasticsearch opera en modo append-only para los índices de Fluentd, y el acceso directo a la API de ES está bloqueado por NetworkPolicy), puede introducir eventos falsos en el SIEM que generen ruido y potencialmente evadir alertas por thresholds. El K8s audit log, almacenado en el control-plane y fuera del alcance del pod de aplicación, permaneció inaccesible (/host/ no montado, CapEff: 0x0000000000000000). Este hallazgo fue clasificado como de prioridad media y motivó la implementació de validación de integridad mediante hashes SHA-256 sobre los eventos antes de su ingesta en Elasticsearch.</w:t>
+      </w:r>
+    </w:p>
+    <w:p>
+      <w:pPr>
         <w:spacing w:after="120" w:before="120" w:line="276" w:lineRule="auto"/>
         <w:jc w:val="both"/>
         <w:rPr/>
@@ -6762,7 +6744,7 @@
         <w:rPr>
           <w:b/>
         </w:rPr>
-        <w:t xml:space="preserve">Fig. 4. </w:t>
+        <w:t xml:space="preserve">Fig. 2. </w:t>
       </w:r>
       <w:r>
         <w:rPr/>
@@ -6781,7 +6763,7 @@
           <w:color w:val="000000"/>
           <w:rtl w:val="0"/>
         </w:rPr>
-        <w:t xml:space="preserve">4.3 PoC-002: Corrupción de registros de auditoría (SCE-I-002)</w:t>
+        <w:t xml:space="preserve">4.4 PoC-003 a PoC-005: Experimentos adicionales</w:t>
       </w:r>
     </w:p>
     <w:p>
@@ -6794,7 +6776,7 @@
         <w:rPr>
           <w:rtl w:val="0"/>
         </w:rPr>
-        <w:t xml:space="preserve">Se ejecutó el experimento SCE-I-002 para validar la integridad del sistema de logging. El entorno utiliza Fluentd como DaemonSet para recopilación de logs y los envía a Elasticsearch con verificación de integridad mediante hashes SHA-256 calculados en origen. Los logs se retienen en el nodo de origen durante 24 horas antes de eliminarse.</w:t>
+        <w:t xml:space="preserve">Adicionalmente a las dos pruebas de concepto detalladas, se ejecutaron tres experimentos complementarios que, por razones de extensión, se documentan aquí de forma resumida.</w:t>
       </w:r>
     </w:p>
     <w:p>
@@ -6807,63 +6789,7 @@
         <w:rPr>
           <w:rtl w:val="0"/>
         </w:rPr>
-        <w:t xml:space="preserve">La inyección consistió en intentar, desde un pod de aplicación con credenciales de nivel de servicio: escribir directamente en el directorio /var/log/containers del nodo (bloqueado por el Security Context del pod que deshabilita privilegios y </w:t>
-      </w:r>
-      <w:r>
-        <w:rPr>
-          <w:i w:val="1"/>
-          <w:iCs w:val="1"/>
-          <w:rtl w:val="0"/>
-        </w:rPr>
-        <w:t xml:space="preserve">runAsNonRoot</w:t>
-      </w:r>
-      <w:r>
-        <w:rPr>
-          <w:rtl w:val="0"/>
-        </w:rPr>
-        <w:t xml:space="preserve">: true); intentar modificar la configuración del DaemonSet de Fluentd mediante kubectl con el </w:t>
-      </w:r>
-      <w:r>
-        <w:rPr>
-          <w:i w:val="1"/>
-          <w:iCs w:val="1"/>
-          <w:rtl w:val="0"/>
-        </w:rPr>
-        <w:t xml:space="preserve">ServiceAccount</w:t>
-      </w:r>
-      <w:r>
-        <w:rPr>
-          <w:rtl w:val="0"/>
-        </w:rPr>
-        <w:t xml:space="preserve"> del pod de aplicación (rechazado con error 403, ya que el RBAC no otorga permisos de escritura sobre </w:t>
-      </w:r>
-      <w:r>
-        <w:rPr>
-          <w:i w:val="1"/>
-          <w:iCs w:val="1"/>
-          <w:rtl w:val="0"/>
-        </w:rPr>
-        <w:t xml:space="preserve">DaemonSets</w:t>
-      </w:r>
-      <w:r>
-        <w:rPr>
-          <w:rtl w:val="0"/>
-        </w:rPr>
-        <w:t xml:space="preserve"> al </w:t>
-      </w:r>
-      <w:r>
-        <w:rPr>
-          <w:i w:val="1"/>
-          <w:iCs w:val="1"/>
-          <w:rtl w:val="0"/>
-        </w:rPr>
-        <w:t xml:space="preserve">ServiceAccount</w:t>
-      </w:r>
-      <w:r>
-        <w:rPr>
-          <w:rtl w:val="0"/>
-        </w:rPr>
-        <w:t xml:space="preserve"> de aplicación); intentar acceder a la API de Elasticsearch directamente para eliminar índices (rechazado: la política de red no permite egress desde el namespace de aplicación hacia el namespace de infraestructura).</w:t>
+        <w:t xml:space="preserve">La PoC-003, correspondiente a SCE-D-001 (agotamiento del servicio de identidades), confirmó la hipótesis de fail-secure de manera limpia. La ejecución del 9 de abril de 2026 estableció un baseline de 100% de disponibilidad (3/3 HTTP 200 en 15 segundos), escaló auth-service a 0 réplicas, y midió la disponibilidad durante la ventana de cache JWT (TTL=300s): 6/6 peticiones fallaron con HTTP 503 (disponibilidad 0%) durante los 30 segundos de observación. El análisis de los logs de user-api confirmó que el servicio rechazaba activamente las peticiones por no poder validar tokens con auth-service, en lugar de degradarse silenciosamente a una postura fail-open. El rollback (kubectl scale --replicas=1) restauró la disponibilidad al 100% en menos de 30 segundos, confirmado por una petición HTTP 200 post-rollback. El experimento no reveló hallazgos secundarios: la ausencia de fallos inesperados es en sí mismo un resultado valioso, ya que confirma que el diseño fail-secure del sistema funciona correctamente bajo condiciones de indisponibilidad del IDP.</w:t>
       </w:r>
     </w:p>
     <w:p>
@@ -6876,22 +6802,21 @@
         <w:rPr>
           <w:rtl w:val="0"/>
         </w:rPr>
-        <w:t xml:space="preserve">La hipótesis fue confirmada en los vectores de escritura directa y acceso a Elasticsearch. Sin embargo, el experimento reveló un hallazgo significativo en la Fase 2 (166 ms): es posible inyectar líneas falsas en el flujo de logs escribiendo directamente al descriptor de archivo /proc/1/fd/1 del proceso principal del contenedor (stdout), sin necesidad de privilegios adicionales. La línea inyectada “{“level”:“INFO”,“msg”:“legitimate-looking-but-fake”,“user”:“admin”,“action”:“login_success”}” fue recogida por Fluentd y enviada a Elasticsearch, donde quedó registrada como un evento legítimo. Este hallazgo es significativo: aunque el atacante no puede eliminar registros reales (Elasticsearch opera en modo append-only para los índices de Fluentd, y el acceso directo a la API de ES está bloqueado por NetworkPolicy), puede introducir eventos falsos en el SIEM que generen ruido y potencialmente evadir alertas por thresholds. El K8s audit log, almacenado en el control-plane y fuera del alcance del pod de aplicación, permaneció inaccesible (/host/ no montado, CapEff: 0x0000000000000000). Este hallazgo fue clasificado como de prioridad media y motivó la implementació de validación de integridad mediante hashes SHA-256 sobre los eventos antes de su ingesta en Elasticsearch.</w:t>
-      </w:r>
-    </w:p>
-    <w:p>
-      <w:pPr>
-        <w:pStyle w:val="Heading2"/>
-        <w:rPr>
-          <w:color w:val="000000"/>
-        </w:rPr>
-      </w:pPr>
-      <w:r>
-        <w:rPr>
-          <w:color w:val="000000"/>
-          <w:rtl w:val="0"/>
-        </w:rPr>
-        <w:t xml:space="preserve">4.4 PoC-003 a PoC-005: Experimentos adicionales</w:t>
+        <w:t xml:space="preserve">La PoC-004, correspondiente a SCE-C-002 (escalación de RBAC), produjo un resultado indeterminado: los logs de auditoría de la API de Kubernetes no estaban habilitados con el nivel de detalle necesario (el nivel configurado era Request, cuando el experimento requería </w:t>
+      </w:r>
+      <w:r>
+        <w:rPr>
+          <w:i w:val="1"/>
+          <w:iCs w:val="1"/>
+          <w:rtl w:val="0"/>
+        </w:rPr>
+        <w:t xml:space="preserve">RequestResponse</w:t>
+      </w:r>
+      <w:r>
+        <w:rPr>
+          <w:rtl w:val="0"/>
+        </w:rPr>
+        <w:t xml:space="preserve"> para capturar los cuerpos de las respuestas de error). Esto impidió verificar completamente la hipótesis y constituyó en sí mismo un hallazgo de observabilidad.</w:t>
       </w:r>
     </w:p>
     <w:p>
@@ -6904,7 +6829,7 @@
         <w:rPr>
           <w:rtl w:val="0"/>
         </w:rPr>
-        <w:t xml:space="preserve">Adicionalmente a las dos pruebas de concepto detalladas, se ejecutaron tres experimentos complementarios que, por razones de extensión, se documentan aquí de forma resumida.</w:t>
+        <w:t xml:space="preserve">La PoC-005, correspondiente a SCE-D-002 (resiliencia de backups), confirmó la hipótesis principal: las credenciales de producción no tienen acceso a los buckets de backup (segregación lograda mediante políticas de IAM separadas). Sin embargo, el proceso de restauración completo tomó 47 minutos, superando el RTO definido de 30 minutos. Este hallazgo motivó la optimización del script de restauración y la preconfiguración de credenciales temporales para acelerar el proceso.</w:t>
       </w:r>
     </w:p>
     <w:p>
@@ -6914,50 +6839,61 @@
         <w:rPr/>
       </w:pPr>
       <w:r>
-        <w:rPr>
-          <w:rtl w:val="0"/>
-        </w:rPr>
-        <w:t xml:space="preserve">La PoC-003, correspondiente a SCE-D-001 (agotamiento del servicio de identidades), confirmó la hipótesis de fail-secure de manera limpia. La ejecución del 9 de abril de 2026 estableció un baseline de 100% de disponibilidad (3/3 HTTP 200 en 15 segundos), escaló auth-service a 0 réplicas, y midió la disponibilidad durante la ventana de cache JWT (TTL=300s): 6/6 peticiones fallaron con HTTP 503 (disponibilidad 0%) durante los 30 segundos de observación. El análisis de los logs de user-api confirmó que el servicio rechazaba activamente las peticiones por no poder validar tokens con auth-service, en lugar de degradarse silenciosamente a una postura fail-open. El rollback (kubectl scale --replicas=1) restauró la disponibilidad al 100% en menos de 30 segundos, confirmado por una petición HTTP 200 post-rollback. El experimento no reveló hallazgos secundarios: la ausencia de fallos inesperados es en sí mismo un resultado valioso, ya que confirma que el diseño fail-secure del sistema funciona correctamente bajo condiciones de indisponibilidad del IDP.</w:t>
-      </w:r>
-    </w:p>
-    <w:p>
-      <w:pPr>
-        <w:spacing w:after="120" w:before="120" w:line="276" w:lineRule="auto"/>
-        <w:jc w:val="both"/>
-        <w:rPr/>
-      </w:pPr>
-      <w:r>
-        <w:rPr>
-          <w:rtl w:val="0"/>
-        </w:rPr>
-        <w:t xml:space="preserve">La PoC-004, correspondiente a SCE-C-002 (escalación de RBAC), produjo un resultado indeterminado: los logs de auditoría de la API de Kubernetes no estaban habilitados con el nivel de detalle necesario (el nivel configurado era Request, cuando el experimento requería </w:t>
-      </w:r>
-      <w:r>
-        <w:rPr>
-          <w:i w:val="1"/>
-          <w:iCs w:val="1"/>
-          <w:rtl w:val="0"/>
-        </w:rPr>
-        <w:t xml:space="preserve">RequestResponse</w:t>
-      </w:r>
-      <w:r>
-        <w:rPr>
-          <w:rtl w:val="0"/>
-        </w:rPr>
-        <w:t xml:space="preserve"> para capturar los cuerpos de las respuestas de error). Esto impidió verificar completamente la hipótesis y constituyó en sí mismo un hallazgo de observabilidad.</w:t>
-      </w:r>
-    </w:p>
-    <w:p>
-      <w:pPr>
-        <w:spacing w:after="120" w:before="120" w:line="276" w:lineRule="auto"/>
-        <w:jc w:val="both"/>
-        <w:rPr/>
-      </w:pPr>
-      <w:r>
-        <w:rPr>
-          <w:rtl w:val="0"/>
-        </w:rPr>
-        <w:t xml:space="preserve">La PoC-005, correspondiente a SCE-D-002 (resiliencia de backups), confirmó la hipótesis principal: las credenciales de producción no tienen acceso a los buckets de backup (segregación lograda mediante políticas de IAM separadas). Sin embargo, el proceso de restauración completo tomó 47 minutos, superando el RTO definido de 30 minutos. Este hallazgo motivó la optimización del script de restauración y la preconfiguración de credenciales temporales para acelerar el proceso.</w:t>
+        <w:rPr/>
+        <w:drawing>
+          <wp:inline distB="114300" distT="114300" distL="114300" distR="114300">
+            <wp:extent cx="5502600" cy="3537385"/>
+            <wp:effectExtent b="0" l="0" r="0" t="0"/>
+            <wp:docPr id="3" name="image2.png"/>
+            <a:graphic>
+              <a:graphicData uri="http://schemas.openxmlformats.org/drawingml/2006/picture">
+                <pic:pic>
+                  <pic:nvPicPr>
+                    <pic:cNvPr id="0" name="image2.png"/>
+                    <pic:cNvPicPr preferRelativeResize="0"/>
+                  </pic:nvPicPr>
+                  <pic:blipFill>
+                    <a:blip r:embed="rId11"/>
+                    <a:srcRect b="0" l="0" r="0" t="0"/>
+                    <a:stretch>
+                      <a:fillRect/>
+                    </a:stretch>
+                  </pic:blipFill>
+                  <pic:spPr>
+                    <a:xfrm>
+                      <a:off x="0" y="0"/>
+                      <a:ext cx="5502600" cy="3537385"/>
+                    </a:xfrm>
+                    <a:prstGeom prst="rect"/>
+                    <a:ln/>
+                  </pic:spPr>
+                </pic:pic>
+              </a:graphicData>
+            </a:graphic>
+          </wp:inline>
+        </w:drawing>
+      </w:r>
+      <w:r>
+        <w:rPr>
+          <w:rtl w:val="0"/>
+        </w:rPr>
+      </w:r>
+    </w:p>
+    <w:p>
+      <w:pPr>
+        <w:spacing w:after="160" w:before="60" w:line="276" w:lineRule="auto"/>
+        <w:jc w:val="center"/>
+        <w:rPr/>
+      </w:pPr>
+      <w:r>
+        <w:rPr>
+          <w:b/>
+        </w:rPr>
+        <w:t xml:space="preserve">Fig. 3. </w:t>
+      </w:r>
+      <w:r>
+        <w:rPr/>
+        <w:t>Salida de consola del experimento SCE-D-001 — Disponibilidad: verificación del comportamiento fail-secure del servicio de autenticación ante escenario de escala-a-cero. [Fuente: Elaboración propia, 2026.]</w:t>
       </w:r>
     </w:p>
     <w:p>
@@ -7952,6 +7888,70 @@
       <w:r>
         <w:rPr/>
         <w:t>Fuente: Elaboración propia, 2026.</w:t>
+      </w:r>
+    </w:p>
+    <w:p>
+      <w:pPr>
+        <w:spacing w:after="120" w:before="120" w:line="276" w:lineRule="auto"/>
+        <w:jc w:val="both"/>
+        <w:rPr/>
+      </w:pPr>
+      <w:r>
+        <w:rPr/>
+        <w:drawing>
+          <wp:inline distB="114300" distT="114300" distL="114300" distR="114300">
+            <wp:extent cx="5502600" cy="3537385"/>
+            <wp:effectExtent b="0" l="0" r="0" t="0"/>
+            <wp:docPr id="4" name="image4.png"/>
+            <a:graphic>
+              <a:graphicData uri="http://schemas.openxmlformats.org/drawingml/2006/picture">
+                <pic:pic>
+                  <pic:nvPicPr>
+                    <pic:cNvPr id="0" name="image4.png"/>
+                    <pic:cNvPicPr preferRelativeResize="0"/>
+                  </pic:nvPicPr>
+                  <pic:blipFill>
+                    <a:blip r:embed="rId10"/>
+                    <a:srcRect b="0" l="0" r="0" t="0"/>
+                    <a:stretch>
+                      <a:fillRect/>
+                    </a:stretch>
+                  </pic:blipFill>
+                  <pic:spPr>
+                    <a:xfrm>
+                      <a:off x="0" y="0"/>
+                      <a:ext cx="5502600" cy="3537385"/>
+                    </a:xfrm>
+                    <a:prstGeom prst="rect"/>
+                    <a:ln/>
+                  </pic:spPr>
+                </pic:pic>
+              </a:graphicData>
+            </a:graphic>
+          </wp:inline>
+        </w:drawing>
+      </w:r>
+      <w:r>
+        <w:rPr>
+          <w:rtl w:val="0"/>
+        </w:rPr>
+      </w:r>
+    </w:p>
+    <w:p>
+      <w:pPr>
+        <w:spacing w:after="160" w:before="60" w:line="276" w:lineRule="auto"/>
+        <w:jc w:val="center"/>
+        <w:rPr/>
+      </w:pPr>
+      <w:r>
+        <w:rPr>
+          <w:b/>
+        </w:rPr>
+        <w:t xml:space="preserve">Fig. 4. </w:t>
+      </w:r>
+      <w:r>
+        <w:rPr/>
+        <w:t>Vistas k9s del clúster sce-lab durante la ejecución de los tres experimentos SCE: estado de pods, políticas de red activas y hallazgos de seguridad detectados por experimento. [Fuente: Elaboración propia, 2026.]</w:t>
       </w:r>
     </w:p>
     <w:p>

</xml_diff>